<commit_message>
Corrige ONI por safra, integra clima do NASA POWER e adota modelo final FL
- Corrige a atribuição do ONI à safra (OND/NDJ iam para dois anos depois)
  e reexecuta os notebooks; atualiza figuras 2 e 3 e números dependentes
- Fixa as versões das bibliotecas em requirements.txt
- Adiciona dataset/baixar_nasa_power.py e os dados diários do NASA POWER
  (87 células da grade que cobrem os municípios do RS, 2000-2025)
- Etapa 4 passa a salvar o balanço hídrico das estações
- Adiciona Etapa 5 (modelagem_etapa5_nasa_power.ipynb): comparação
  INMET x NASA POWER, cobertura de 5.260 para 8.651 pares município-safra
  e novo modelo final FL (F + limiar de seca extrema do déficit hídrico)
- Atualiza artigo (LaTeX e Word), figuras 4 a 6, READMEs e .gitignore
</commit_message>
<xml_diff>
--- a/artigo/word/Relatorio_N1_Soja_RS.docx
+++ b/artigo/word/Relatorio_N1_Soja_RS.docx
@@ -189,7 +189,7 @@
           <w:sz w:val="22"/>
           <w:szCs w:val="22"/>
         </w:rPr>
-        <w:t xml:space="preserve">O Rio Grande do Sul apresenta elevada variabilidade interanual na produtividade da soja, em grande parte causada por secas de verão. Este trabalho, na opção Framework, desenvolve e avalia uma abordagem de aprendizado de máquina para prever a produtividade municipal da soja no estado a partir de dados públicos: a Tabela 1612 do IBGE/SIDRA (municípios do RS, 2000–2025), dados diários das estações do INMET e o Oceanic Niño Index (ONI) da NOAA. O clima foi agregado por subperíodo do ciclo da cultura e complementado por um balanço hídrico diário (evapotranspiração de Hargreaves–Samani e modelo de balde). Cada previsão combina um patamar esperado – a média do município nas cinco safras anteriores – com um desvio explicado pelo clima, usando apenas informações disponíveis ao fim de março. Regressão Linear, Random Forest e Gradient Boosting foram comparados com duas linhas de base históricas, em validação com corte temporal (teste 2021–2025) e deixando uma safra de fora. O melhor modelo, uma regressão linear com déficit hídrico e limiares de seca extrema, reduziu o RMSE em 14% e 22% em relação à média histórica do município (740 e 684 kg/ha; R</w:t>
+        <w:t xml:space="preserve">O Rio Grande do Sul apresenta elevada variabilidade interanual na produtividade da soja, em grande parte causada por secas de verão. Este trabalho, na opção Framework, desenvolve e avalia uma abordagem de aprendizado de máquina para prever a produtividade municipal da soja no estado a partir de dados públicos: a Tabela 1612 do IBGE/SIDRA (municípios do RS, 2000–2025), dados climáticos diários das estações do INMET e da base em grade NASA POWER, e o Oceanic Niño Index (ONI) da NOAA. O clima foi agregado por subperíodo do ciclo da cultura e complementado por um balanço hídrico diário (evapotranspiração de Hargreaves–Samani e modelo de balde). Cada previsão combina um patamar esperado – a média do município nas cinco safras anteriores – com um desvio explicado pelo clima, usando apenas informações disponíveis ao fim de março. Regressão Linear, Random Forest e Gradient Boosting foram comparados com duas linhas de base históricas, em validação com corte temporal (teste 2021–2025) e deixando uma safra de fora. A troca das estações pelo NASA POWER ampliou a cobertura de 5.260 para 8.651 pares município–safra e reduziu o erro nos mesmos pares. O modelo final, uma regressão linear com um único termo de seca extrema para o déficit hídrico, reduziu o RMSE em 16% e 28% em relação à média histórica do município (739 e 638 kg/ha; R</w:t>
       </w:r>
       <w:r>
         <w:rPr>
@@ -208,7 +208,7 @@
           <w:sz w:val="22"/>
           <w:szCs w:val="22"/>
         </w:rPr>
-        <w:t xml:space="preserve"> de 0,31 e 0,26) e superou os modelos baseados em árvores. A chuva e a umidade relativa mínima de dezembro a fevereiro e o déficit hídrico foram os fatores dominantes, com perdas que se aceleram acima de um déficit de cerca de 243 mm. O modelo antecipou as secas de 2012 e 2023, mas não a de 2020, que não aparece nos dados das estações. Como aplicação, o rendimento esperado foi combinado com as tabelas da Embrapa/CQFS-RS/SC para gerar recomendações de adubação fosfatada e potássica por classe de teor do solo para a safra 2026.</w:t>
+        <w:t xml:space="preserve"> de 0,34 e 0,38) e superou os modelos baseados em árvores. A chuva e a umidade relativa mínima de dezembro a fevereiro foram os fatores dominantes, com perdas que se aceleram acima de um déficit de cerca de 290 mm. O modelo antecipou a seca de 2023 e parte das de 2012 e 2022, mas só uma pequena parcela da perda de 2020. Como aplicação, o rendimento esperado foi combinado com as tabelas da Embrapa/CQFS-RS/SC para gerar recomendações de adubação fosfatada e potássica por classe de teor do solo para a safra 2026.</w:t>
       </w:r>
     </w:p>
     <w:p>
@@ -296,7 +296,7 @@
           <w:sz w:val="22"/>
           <w:szCs w:val="22"/>
         </w:rPr>
-        <w:t xml:space="preserve">Rio Grande do Sul shows substantial year-to-year variability in soybean yield, largely driven by summer droughts. This work, under the Framework option, develops and evaluates a machine learning approach to forecast municipal soybean yield in the state from public data: IBGE/SIDRA Table 1612 (RS municipalities, 2000–2025), daily INMET weather station data and NOAA's Oceanic Niño Index (ONI). Climate was aggregated by crop development sub-period and complemented by a daily soil water balance (Hargreaves–Samani evapotranspiration and a bucket model). Each forecast combines an expected yield level – the municipality's mean over the five previous seasons – with a climate-driven deviation, using only information available by the end of March. Linear Regression, Random Forest and Gradient Boosting were compared against two historical baselines under a temporal split (test 2021–2025) and leave-one-season-out validation. The best model, a linear regression with water deficit and extreme-drought thresholds, reduced RMSE by 14% and 22% relative to the municipal historical mean (740 and 684 kg/ha; R</w:t>
+        <w:t xml:space="preserve">Rio Grande do Sul shows substantial year-to-year variability in soybean yield, largely driven by summer droughts. This work, under the Framework option, develops and evaluates a machine learning approach to forecast municipal soybean yield in the state from public data: IBGE/SIDRA Table 1612 (RS municipalities, 2000–2025), daily weather data from INMET stations and from the NASA POWER gridded dataset, and NOAA's Oceanic Niño Index (ONI). Climate was aggregated by crop development sub-period and complemented by a daily soil water balance (Hargreaves–Samani evapotranspiration and a bucket model). Each forecast combines an expected yield level – the municipality's mean over the five previous seasons – with a climate-driven deviation, using only information available by the end of March. Linear Regression, Random Forest and Gradient Boosting were compared against two historical baselines under a temporal split (test 2021–2025) and leave-one-season-out validation. Replacing station data with NASA POWER raised coverage from 5,260 to 8,651 municipality-season pairs and lowered the error on the same pairs. The final model, a linear regression with a single extreme-drought term for water deficit, reduced RMSE by 16% and 28% relative to the municipal historical mean (739 and 638 kg/ha; R</w:t>
       </w:r>
       <w:r>
         <w:rPr>
@@ -315,7 +315,7 @@
           <w:sz w:val="22"/>
           <w:szCs w:val="22"/>
         </w:rPr>
-        <w:t xml:space="preserve"> of 0.31 and 0.26) and outperformed the tree-based models. December–February rainfall, minimum relative humidity and water deficit were the dominant factors, with losses accelerating beyond a deficit of about 243 mm. The model anticipated the 2012 and 2023 droughts but not the 2020 one, which was not visible in station data. As an application, expected yields were combined with Embrapa/CQFS-RS/SC tables to produce phosphate and potassium fertilization recommendations by soil-test class for the 2026 season.</w:t>
+        <w:t xml:space="preserve"> of 0.34 and 0.38) and outperformed the tree-based models. December–February rainfall and minimum relative humidity were the dominant factors, with losses accelerating beyond a deficit of about 290 mm. The model anticipated the 2023 drought and part of the 2012 and 2022 ones, but only a small share of the 2020 loss. As an application, expected yields were combined with Embrapa/CQFS-RS/SC tables to produce phosphate and potassium fertilization recommendations by soil-test class for the 2026 season.</w:t>
       </w:r>
     </w:p>
     <w:p>
@@ -504,7 +504,21 @@
           <w:sz w:val="24"/>
           <w:szCs w:val="24"/>
         </w:rPr>
-        <w:t xml:space="preserve">construir atributos climáticos por subperíodo do ciclo da soja e de balanço hídrico a partir dos dados diários do INMET, além do ONI por safra;</w:t>
+        <w:t xml:space="preserve">construir atributos climáticos por subperíodo do ciclo da soja e de balanço hídrico a partir dos </w:t>
+      </w:r>
+      <w:r>
+        <w:rPr>
+          <w:sz w:val="24"/>
+          <w:szCs w:val="24"/>
+        </w:rPr>
+        <w:t xml:space="preserve">dados diários do INMET e do NASA POWER, além do ONI</w:t>
+      </w:r>
+      <w:r>
+        <w:rPr>
+          <w:sz w:val="24"/>
+          <w:szCs w:val="24"/>
+        </w:rPr>
+        <w:t xml:space="preserve"> por safra;</w:t>
       </w:r>
     </w:p>
     <w:p>
@@ -615,7 +629,21 @@
           <w:sz w:val="24"/>
           <w:szCs w:val="24"/>
         </w:rPr>
-        <w:t xml:space="preserve">O problema consiste em estimar a produtividade da soja para cada combinação município–safra no Rio Grande do Sul a partir de informações climáticas associadas àquela safra. A variável-alvo é o rendimento médio municipal da soja, expresso em kg/ha; as variáveis explicativas são formadas pelo histórico produtivo do município (patamar esperado), por variáveis climáticas por subperíodo do ciclo e de balanço hídrico (INMET) e pelo estado do ENOS (índice ONI). Os dados nunca são divididos de forma aleatória, para evitar vazamento de informação futura: o patamar de cada safra usa apenas safras anteriores, e os modelos são avaliados com corte temporal (treino com safras mais antigas, teste com as mais recentes) e deixando uma safra de fora. Os hiperparâmetros dos modelos de árvores foram fixados a priori, sem ajuste fino, para que as safras de teste não influenciem a escolha do modelo. Optou-se por tratar o problema como uma regressão em painel (municípios empilhados, com o patamar histórico do município como referência) em vez de um modelo de série temporal clássico por município, porque a série de cada município cobre cerca de 26 safras (2000–2025) – abaixo do mínimo prático para ajustar um ARIMA ou uma rede recorrente de forma confiável, agravado pela criação de novos municípios por desmembramento ao longo do período.</w:t>
+        <w:t xml:space="preserve">O problema consiste em estimar a produtividade da soja para cada combinação município–safra no Rio Grande do Sul a partir de informações climáticas associadas àquela safra. A variável-alvo é o rendimento médio municipal da soja, expresso em kg/ha; as variáveis explicativas são formadas pelo histórico produtivo do município (patamar esperado), por variáveis climáticas por subperíodo do ciclo e de </w:t>
+      </w:r>
+      <w:r>
+        <w:rPr>
+          <w:sz w:val="24"/>
+          <w:szCs w:val="24"/>
+        </w:rPr>
+        <w:t xml:space="preserve">balanço hídrico (INMET e NASA POWER) e pelo estado</w:t>
+      </w:r>
+      <w:r>
+        <w:rPr>
+          <w:sz w:val="24"/>
+          <w:szCs w:val="24"/>
+        </w:rPr>
+        <w:t xml:space="preserve"> do ENOS (índice ONI). Os dados nunca são divididos de forma aleatória, para evitar vazamento de informação futura: o patamar de cada safra usa apenas safras anteriores, e os modelos são avaliados com corte temporal (treino com safras mais antigas, teste com as mais recentes) e deixando uma safra de fora. Os hiperparâmetros dos modelos de árvores foram fixados a priori, sem ajuste fino, para que as safras de teste não influenciem a escolha do modelo. Optou-se por tratar o problema como uma regressão em painel (municípios empilhados, com o patamar histórico do município como referência) em vez de um modelo de série temporal clássico por município, porque a série de cada município cobre cerca de 26 safras (2000–2025) – abaixo do mínimo prático para ajustar um ARIMA ou uma rede recorrente de forma confiável, agravado pela criação de novos municípios por desmembramento ao longo do período.</w:t>
       </w:r>
     </w:p>
     <w:p>
@@ -659,7 +687,21 @@
           <w:sz w:val="24"/>
           <w:szCs w:val="24"/>
         </w:rPr>
-        <w:t xml:space="preserve">Diversos estudos aplicam aprendizado de máquina à previsão de produtividade agrícola. Jeong et al. (2016) mostraram que Random Forest supera modelos de regressão múltipla na previsão de produtividade de grãos em múltiplas regiões do mundo. Van Klompenburg, Kassahun e Catal (2020), em revisão sistemática, identificam Random Forest e redes neurais como os algoritmos mais utilizados para previsão de safra, destacando a importância de variáveis climáticas e a necessidade de validação temporal para evitar vazamento de dados. Especificamente para a soja no Sul do Brasil, Pilau et al. (2022) e Nóia Júnior et al. (2020) documentam efeito negativo consistente da fase fria do ENOS (La Niña) sobre a produtividade da soja no Rio Grande do Sul, o que justifica a inclusão do ONI como atributo. Von Bloh et al. (2023) comparam modelos de machine learning para previsão de produtividade de soja no Brasil e reforçam a vantagem de modelos baseados em árvores frente a baselines lineares quando há relações não lineares entre clima e rendimento. Este trabalho testa essa vantagem num cenário de dados limitados (cerca de 5 mil pares município–safra), com o patamar de produtividade calculado apenas com safras anteriores, e liga a previsão municipal a uma aplicação prática: a recomendação de adubação fosfatada e potássica.</w:t>
+        <w:t xml:space="preserve">Diversos estudos aplicam aprendizado de máquina à previsão de produtividade agrícola. Jeong et al. (2016) mostraram que Random Forest supera modelos de regressão múltipla na previsão de produtividade de grãos em múltiplas regiões do mundo. Van Klompenburg, Kassahun e Catal (2020), em revisão sistemática, identificam Random Forest e redes neurais como os algoritmos mais utilizados para previsão de safra, destacando a importância de variáveis climáticas e a necessidade de validação temporal para evitar vazamento de dados. Especificamente para a soja no Sul do Brasil, Pilau et al. (2022) e Nóia Júnior et al. (2020) documentam efeito negativo consistente da fase fria do ENOS (La Niña) sobre a produtividade da soja no Rio Grande do Sul, o que justifica a inclusão do ONI como atributo. Von Bloh et al. (2023) comparam modelos de machine learning para previsão de produtividade de soja no Brasil e reforçam a vantagem de modelos baseados em árvores frente a baselines lineares quando há relações não lineares entre clima e rendimento. Este trabalho testa essa vantagem num cenário de dados limitados (</w:t>
+      </w:r>
+      <w:r>
+        <w:rPr>
+          <w:sz w:val="24"/>
+          <w:szCs w:val="24"/>
+        </w:rPr>
+        <w:t xml:space="preserve">cerca de 8,6 mil pares</w:t>
+      </w:r>
+      <w:r>
+        <w:rPr>
+          <w:sz w:val="24"/>
+          <w:szCs w:val="24"/>
+        </w:rPr>
+        <w:t xml:space="preserve"> município–safra), com o patamar de produtividade calculado apenas com safras anteriores, e liga a previsão municipal a uma aplicação prática: a recomendação de adubação fosfatada e potássica.</w:t>
       </w:r>
     </w:p>
     <w:p>
@@ -1011,7 +1053,69 @@
                 <w:sz w:val="22"/>
                 <w:szCs w:val="22"/>
               </w:rPr>
-              <w:t xml:space="preserve">Variáveis climáticas por subperíodo do ciclo e balanço hídrico.</w:t>
+              <w:t xml:space="preserve">Variáveis climáticas por subperíodo do ciclo e balanço hídrico (Etapas 2–4) e comparação com o NASA POWER.</w:t>
+            </w:r>
+          </w:p>
+        </w:tc>
+      </w:tr>
+      <w:tr>
+        <w:tc>
+          <w:tcPr>
+            <w:tcW w:w="2300" w:type="dxa"/>
+            <w:tcMar>
+              <w:top w:w="80" w:type="dxa"/>
+              <w:left w:w="100" w:type="dxa"/>
+              <w:bottom w:w="80" w:type="dxa"/>
+              <w:right w:w="100" w:type="dxa"/>
+            </w:tcMar>
+          </w:tcPr>
+          <w:p>
+            <w:r>
+              <w:rPr>
+                <w:sz w:val="22"/>
+                <w:szCs w:val="22"/>
+              </w:rPr>
+              <w:t xml:space="preserve">NASA POWER (NASA/LaRC)</w:t>
+            </w:r>
+          </w:p>
+        </w:tc>
+        <w:tc>
+          <w:tcPr>
+            <w:tcW w:w="3400" w:type="dxa"/>
+            <w:tcMar>
+              <w:top w:w="80" w:type="dxa"/>
+              <w:left w:w="100" w:type="dxa"/>
+              <w:bottom w:w="80" w:type="dxa"/>
+              <w:right w:w="100" w:type="dxa"/>
+            </w:tcMar>
+          </w:tcPr>
+          <w:p>
+            <w:r>
+              <w:rPr>
+                <w:sz w:val="22"/>
+                <w:szCs w:val="22"/>
+              </w:rPr>
+              <w:t xml:space="preserve">Chuva, temperatura média, máxima e mínima, ponto de orvalho e umidade relativa diários, em grade de 0,5° × 0,625° (reanálise MERRA-2), sem falhas.</w:t>
+            </w:r>
+          </w:p>
+        </w:tc>
+        <w:tc>
+          <w:tcPr>
+            <w:tcW w:w="2800" w:type="dxa"/>
+            <w:tcMar>
+              <w:top w:w="80" w:type="dxa"/>
+              <w:left w:w="100" w:type="dxa"/>
+              <w:bottom w:w="80" w:type="dxa"/>
+              <w:right w:w="100" w:type="dxa"/>
+            </w:tcMar>
+          </w:tcPr>
+          <w:p>
+            <w:r>
+              <w:rPr>
+                <w:sz w:val="22"/>
+                <w:szCs w:val="22"/>
+              </w:rPr>
+              <w:t xml:space="preserve">Fonte do clima do modelo final (Etapa 5), para todos os municípios.</w:t>
             </w:r>
           </w:p>
         </w:tc>
@@ -2011,7 +2115,7 @@
                 <w:sz w:val="22"/>
                 <w:szCs w:val="22"/>
               </w:rPr>
-              <w:t xml:space="preserve">INMET</w:t>
+              <w:t xml:space="preserve">INMET / NASA POWER</w:t>
             </w:r>
           </w:p>
         </w:tc>
@@ -2093,7 +2197,7 @@
                 <w:sz w:val="22"/>
                 <w:szCs w:val="22"/>
               </w:rPr>
-              <w:t xml:space="preserve">INMET</w:t>
+              <w:t xml:space="preserve">INMET / NASA POWER</w:t>
             </w:r>
           </w:p>
         </w:tc>
@@ -2187,7 +2291,7 @@
                 <w:sz w:val="22"/>
                 <w:szCs w:val="22"/>
               </w:rPr>
-              <w:t xml:space="preserve">INMET (calculado)</w:t>
+              <w:t xml:space="preserve">INMET / NASA POWER (calculado)</w:t>
             </w:r>
           </w:p>
         </w:tc>
@@ -2263,7 +2367,21 @@
           <w:sz w:val="24"/>
           <w:szCs w:val="24"/>
         </w:rPr>
-        <w:t xml:space="preserve">Os dados brutos do SIDRA foram obtidos via API pública do IBGE (tabela 1612, variáveis de área plantada, área colhida, produção e rendimento médio, categoria soja em grão) para os 497 municípios do RS, 2000–2025 (26 safras), e reorganizados para o formato município × ano. O ONI foi agregado por janela de safra (outubro do ano anterior a março do ano da safra), também disponível até 2025. Os dados diários do INMET (45 estações automáticas do RS, 2000–2025, obtidos via BDMEP em duas etapas) foram associados a cada município pela estação mais próxima (distância de Haversine) e agregados na mesma janela de safra (soma de precipitação, média de temperatura), com combinações estação–safra de janela incompleta (menos de 150 dos ~182 dias esperados, por falha de equipamento ou estação recém-instalada) tratadas como ausentes em vez de soma parcial. Os dados de adubação fosfatada (Embrapa/CQFS-RS/SC) não foram integrados ao painel como variável, por serem uma tabela de referência por classe de solo, e não uma série observada por município; seu uso, como aplicação do modelo, é descrito na Seção 6.6.</w:t>
+        <w:t xml:space="preserve">Os dados brutos do SIDRA foram obtidos via API pública do IBGE (tabela 1612, variáveis de área plantada, área colhida, produção e rendimento médio, categoria soja em grão) para os 497 municípios do RS, 2000–2025 (26 safras), e reorganizados para o formato município × ano. O ONI foi agregado por janela de safra (outubro do ano anterior a março do ano da safra), também disponível até 2025. Os dados diários do INMET (45 estações automáticas do RS, 2000–2025, obtidos via BDMEP em duas etapas) foram associados a cada município pela estação mais próxima (distância de Haversine) e agregados na mesma janela de safra (soma de precipitação, média de temperatura), com combinações estação–safra de janela incompleta (menos de 150 dos ~182 dias esperados, por falha de equipamento ou estação recém-instalada) </w:t>
+      </w:r>
+      <w:r>
+        <w:rPr>
+          <w:sz w:val="24"/>
+          <w:szCs w:val="24"/>
+        </w:rPr>
+        <w:t xml:space="preserve">tratadas como ausentes em vez de soma parcial. Os dados diários do NASA POWER (2000–2025, outubro a maio) foram obtidos pela API pública do serviço; como todos os pontos de uma célula da grade recebem o mesmo valor, cada município foi associado à célula que contém a sua coordenada, e os 497 municípios caem em 87 células. A umidade relativa mínima, não fornecida pelo NASA POWER, foi estimada pela razão entre a pressão de vapor no ponto de orvalho e a pressão de saturação na temperatura máxima do dia (Allen et al., 1998). Os dados de adubação</w:t>
+      </w:r>
+      <w:r>
+        <w:rPr>
+          <w:sz w:val="24"/>
+          <w:szCs w:val="24"/>
+        </w:rPr>
+        <w:t xml:space="preserve"> fosfatada (Embrapa/CQFS-RS/SC) não foram integrados ao painel como variável, por serem uma tabela de referência por classe de solo, e não uma série observada por município; seu uso, como aplicação do modelo, é descrito na Seção 6.6.</w:t>
       </w:r>
     </w:p>
     <w:p>
@@ -2438,7 +2556,49 @@
           <w:sz w:val="24"/>
           <w:szCs w:val="24"/>
         </w:rPr>
-        <w:t xml:space="preserve">Considerando todos os pares município-safra, o rendimento médio observado sob La Niña (≈2.151 kg/ha) é inferior ao observado em safras neutras (≈2.432 kg/ha) e sob El Niño (≈2.395 kg/ha). Esse resultado é compatível com Pilau et al. (2022) e Nóia Júnior et al. (2020), que descrevem efeitos negativos consistentes da fase fria do ENOS sobre a produtividade da soja no sul do Brasil, e reforça o uso do ONI como atributo do modelo.</w:t>
+        <w:t xml:space="preserve">Considerando todos os pares município-safra, o rendimento médio observado sob La Niña </w:t>
+      </w:r>
+      <w:r>
+        <w:rPr>
+          <w:sz w:val="24"/>
+          <w:szCs w:val="24"/>
+        </w:rPr>
+        <w:t xml:space="preserve">(≈2.230 kg/ha)</w:t>
+      </w:r>
+      <w:r>
+        <w:rPr>
+          <w:sz w:val="24"/>
+          <w:szCs w:val="24"/>
+        </w:rPr>
+        <w:t xml:space="preserve"> é inferior ao observado em safras neutras </w:t>
+      </w:r>
+      <w:r>
+        <w:rPr>
+          <w:sz w:val="24"/>
+          <w:szCs w:val="24"/>
+        </w:rPr>
+        <w:t xml:space="preserve">(≈2.351 kg/ha)</w:t>
+      </w:r>
+      <w:r>
+        <w:rPr>
+          <w:sz w:val="24"/>
+          <w:szCs w:val="24"/>
+        </w:rPr>
+        <w:t xml:space="preserve"> e sob El Niño </w:t>
+      </w:r>
+      <w:r>
+        <w:rPr>
+          <w:sz w:val="24"/>
+          <w:szCs w:val="24"/>
+        </w:rPr>
+        <w:t xml:space="preserve">(≈2.462 kg/ha)</w:t>
+      </w:r>
+      <w:r>
+        <w:rPr>
+          <w:sz w:val="24"/>
+          <w:szCs w:val="24"/>
+        </w:rPr>
+        <w:t xml:space="preserve">. Esse resultado é compatível com Pilau et al. (2022) e Nóia Júnior et al. (2020), que descrevem efeitos negativos consistentes da fase fria do ENOS sobre a produtividade da soja no sul do Brasil, e reforça o uso do ONI como atributo do modelo.</w:t>
       </w:r>
     </w:p>
     <w:p>
@@ -2511,7 +2671,21 @@
           <w:sz w:val="24"/>
           <w:szCs w:val="24"/>
         </w:rPr>
-        <w:t xml:space="preserve">No nível município-safra (sem separar por município), a correlação entre rendimento e ONI médio da safra é fraca (≈0,22) e entre rendimento e precipitação acumulada na safra é moderada (≈0,38) – coerente com a literatura, mas mostra que variáveis agregadas simples não bastam sozinhas. A hipótese de que Random Forest e Gradient Boosting capturariam melhor as interações não lineares é avaliada na Seção 6. Limitações identificadas na base: (i) a janela do ONI usada é uma primeira aproximação; (ii) municípios distantes das 45 estações do INMET têm o clima estimado por uma estação potencialmente distante; (iii) períodos em que a estação estava em pane geram dados ausentes; (iv) a adubação fosfatada não é uma série observada (Seção 6.6).</w:t>
+        <w:t xml:space="preserve">No nível município-safra (sem separar por município), a correlação entre rendimento e ONI médio da safra </w:t>
+      </w:r>
+      <w:r>
+        <w:rPr>
+          <w:sz w:val="24"/>
+          <w:szCs w:val="24"/>
+        </w:rPr>
+        <w:t xml:space="preserve">é fraca (≈0,16)</w:t>
+      </w:r>
+      <w:r>
+        <w:rPr>
+          <w:sz w:val="24"/>
+          <w:szCs w:val="24"/>
+        </w:rPr>
+        <w:t xml:space="preserve"> e entre rendimento e precipitação acumulada na safra é moderada (≈0,38) – coerente com a literatura, mas mostra que variáveis agregadas simples não bastam sozinhas. A hipótese de que Random Forest e Gradient Boosting capturariam melhor as interações não lineares é avaliada na Seção 6. Limitações identificadas na base: (i) a janela do ONI usada é uma primeira aproximação; (ii) municípios distantes das 45 estações do INMET têm o clima estimado por uma estação potencialmente distante; (iii) períodos em que a estação estava em pane geram dados ausentes; (iv) a adubação fosfatada não é uma série observada (Seção 6.6).</w:t>
       </w:r>
     </w:p>
     <w:p>
@@ -2539,7 +2713,21 @@
           <w:sz w:val="24"/>
           <w:szCs w:val="24"/>
         </w:rPr>
-        <w:t xml:space="preserve">A pesquisa é aplicada, quantitativa e preditiva, com unidade de análise município–safra, restrita ao Rio Grande do Sul. A modelagem foi conduzida em quatro etapas, cada uma motivada pelo diagnóstico dos erros da anterior; todas estão em notebooks Python no GitHub do projeto. Duas alternativas de série temporal foram consideradas e descartadas: uma série agregada por estado (eliminaria a granularidade municipal) e um modelo de série temporal global (ex.: DeepAR, N-BEATS), por desproporção entre esforço e prazo e pelo tamanho reduzido da base.</w:t>
+        <w:t xml:space="preserve">A pesquisa é aplicada, quantitativa e preditiva, com unidade de análise município–safra, restrita ao Rio Grande do Sul. A modelagem foi </w:t>
+      </w:r>
+      <w:r>
+        <w:rPr>
+          <w:sz w:val="24"/>
+          <w:szCs w:val="24"/>
+        </w:rPr>
+        <w:t xml:space="preserve">conduzida em cinco etapas</w:t>
+      </w:r>
+      <w:r>
+        <w:rPr>
+          <w:sz w:val="24"/>
+          <w:szCs w:val="24"/>
+        </w:rPr>
+        <w:t xml:space="preserve">, cada uma motivada pelo diagnóstico dos erros da anterior; todas estão em notebooks Python no GitHub do projeto. Duas alternativas de série temporal foram consideradas e descartadas: uma série agregada por estado (eliminaria a granularidade municipal) e um modelo de série temporal global (ex.: DeepAR, N-BEATS), por desproporção entre esforço e prazo e pelo tamanho reduzido da base.</w:t>
       </w:r>
     </w:p>
     <w:p>
@@ -2751,7 +2939,7 @@
           <w:sz w:val="24"/>
           <w:szCs w:val="24"/>
         </w:rPr>
-        <w:t>5.2 Patamar esperado e modelos</w:t>
+        <w:t xml:space="preserve">5.2 Fonte do clima: estações INMET e NASA POWER</w:t>
       </w:r>
     </w:p>
     <w:p>
@@ -2765,8 +2953,14 @@
           <w:sz w:val="24"/>
           <w:szCs w:val="24"/>
         </w:rPr>
-        <w:t xml:space="preserve">Cada previsão é a soma de um </w:t>
-      </w:r>
+        <w:t xml:space="preserve">Nas Etapas 1 a 4, o clima de cada município veio da estação automática do INMET mais próxima. Com a exigência de cobertura mínima, cerca de metade dos pares município–safra com rendimento ficava fora do modelo por falta de dado da estação. Na Etapa 5, as mesmas variáveis (subperíodos, seca, calor, umidade mínima e balanço hídrico, com as mesmas regras) foram calculadas a partir do NASA POWER, base em grade sem falhas, na célula que contém cada município. As duas fontes foram comparadas em cada estação, e os modelos foram avaliados com cada uma delas nos mesmos pares município–safra, para separar o efeito da fonte do efeito da cobertura.</w:t>
+      </w:r>
+    </w:p>
+    <w:p>
+      <w:pPr>
+        <w:keepNext/>
+        <w:spacing w:before="280" w:after="160"/>
+      </w:pPr>
       <w:r>
         <w:rPr>
           <w:b/>
@@ -2774,30 +2968,7 @@
           <w:sz w:val="24"/>
           <w:szCs w:val="24"/>
         </w:rPr>
-        <w:t xml:space="preserve">patamar</w:t>
-      </w:r>
-      <w:r>
-        <w:rPr>
-          <w:sz w:val="24"/>
-          <w:szCs w:val="24"/>
-        </w:rPr>
-        <w:t xml:space="preserve"> – o rendimento esperado do município numa safra normal – e de um </w:t>
-      </w:r>
-      <w:r>
-        <w:rPr>
-          <w:b/>
-          <w:bCs/>
-          <w:sz w:val="24"/>
-          <w:szCs w:val="24"/>
-        </w:rPr>
-        <w:t xml:space="preserve">desvio</w:t>
-      </w:r>
-      <w:r>
-        <w:rPr>
-          <w:sz w:val="24"/>
-          <w:szCs w:val="24"/>
-        </w:rPr>
-        <w:t xml:space="preserve"> explicado pelo clima. Quatro formas de patamar foram comparadas, todas calculadas apenas com safras anteriores à prevista: reta de tendência estadual com todo o histórico, média móvel dos últimos 5 anos do município, média olímpica dos últimos 5 anos (descartando o melhor e o pior ano) e reta dos últimos 10 anos. A média móvel de 5 anos teve o melhor desempenho e foi adotada.</w:t>
+        <w:t xml:space="preserve">5.3 Patamar esperado e modelos</w:t>
       </w:r>
     </w:p>
     <w:p>
@@ -2811,74 +2982,8 @@
           <w:sz w:val="24"/>
           <w:szCs w:val="24"/>
         </w:rPr>
-        <w:t xml:space="preserve">O desvio foi modelado por: (F) regressão linear reduzida, com uma variável por fenômeno – chuva de out–nov, chuva de dez–fev e seu quadrado, chuva de março, dias de calor e umidade mínima de dez–fev; (H1) F acrescida do déficit hídrico; (H2) H1 acrescida de dois termos de seca extrema, max(0, U</w:t>
-      </w:r>
-      <w:r>
-        <w:rPr>
-          <w:sz w:val="24"/>
-          <w:szCs w:val="24"/>
-          <w:vertAlign w:val="subscript"/>
-        </w:rPr>
-        <w:t xml:space="preserve">20</w:t>
-      </w:r>
-      <w:r>
-        <w:rPr>
-          <w:sz w:val="24"/>
-          <w:szCs w:val="24"/>
-        </w:rPr>
-        <w:t xml:space="preserve"> − U) e max(0, D − D</w:t>
-      </w:r>
-      <w:r>
-        <w:rPr>
-          <w:sz w:val="24"/>
-          <w:szCs w:val="24"/>
-          <w:vertAlign w:val="subscript"/>
-        </w:rPr>
-        <w:t xml:space="preserve">80</w:t>
-      </w:r>
-      <w:r>
-        <w:rPr>
-          <w:sz w:val="24"/>
-          <w:szCs w:val="24"/>
-        </w:rPr>
-        <w:t xml:space="preserve">), em que U é a umidade mínima, D o déficit hídrico e U</w:t>
-      </w:r>
-      <w:r>
-        <w:rPr>
-          <w:sz w:val="24"/>
-          <w:szCs w:val="24"/>
-          <w:vertAlign w:val="subscript"/>
-        </w:rPr>
-        <w:t xml:space="preserve">20</w:t>
-      </w:r>
-      <w:r>
-        <w:rPr>
-          <w:sz w:val="24"/>
-          <w:szCs w:val="24"/>
-        </w:rPr>
-        <w:t xml:space="preserve"> e D</w:t>
-      </w:r>
-      <w:r>
-        <w:rPr>
-          <w:sz w:val="24"/>
-          <w:szCs w:val="24"/>
-          <w:vertAlign w:val="subscript"/>
-        </w:rPr>
-        <w:t xml:space="preserve">80</w:t>
-      </w:r>
-      <w:r>
-        <w:rPr>
-          <w:sz w:val="24"/>
-          <w:szCs w:val="24"/>
-        </w:rPr>
-        <w:t xml:space="preserve"> os níveis que delimitam as 20% safras mais secas do treino – esses termos valem zero em safras normais e permitem que a perda cresça mais rápido na seca forte; (GB) Gradient Boosting com todas as variáveis climáticas, o ONI e as do balanço hídrico; e a média simples de H2 e GB. Random Forest (500 árvores) foi avaliado nas primeiras etapas. Os hiperparâmetros das árvores foram fixados a priori (Gradient Boosting: taxa de aprendizado 0,05, até 500 iterações com parada antecipada). As linhas de base são a média histórica do município (todas as safras anteriores) e o rendimento da safra anterior. O modelo usa apenas informações disponíveis até o fim de março (a chuva de março é a última variável), permitindo a previsão cerca de um mês antes da colheita (abril–maio).</w:t>
-      </w:r>
-    </w:p>
-    <w:p>
-      <w:pPr>
-        <w:keepNext/>
-        <w:spacing w:before="280" w:after="160"/>
-      </w:pPr>
+        <w:t xml:space="preserve">Cada previsão é a soma de um </w:t>
+      </w:r>
       <w:r>
         <w:rPr>
           <w:b/>
@@ -2886,7 +2991,30 @@
           <w:sz w:val="24"/>
           <w:szCs w:val="24"/>
         </w:rPr>
-        <w:t>5.3 Validação e métricas</w:t>
+        <w:t xml:space="preserve">patamar</w:t>
+      </w:r>
+      <w:r>
+        <w:rPr>
+          <w:sz w:val="24"/>
+          <w:szCs w:val="24"/>
+        </w:rPr>
+        <w:t xml:space="preserve"> – o rendimento esperado do município numa safra normal – e de um </w:t>
+      </w:r>
+      <w:r>
+        <w:rPr>
+          <w:b/>
+          <w:bCs/>
+          <w:sz w:val="24"/>
+          <w:szCs w:val="24"/>
+        </w:rPr>
+        <w:t xml:space="preserve">desvio</w:t>
+      </w:r>
+      <w:r>
+        <w:rPr>
+          <w:sz w:val="24"/>
+          <w:szCs w:val="24"/>
+        </w:rPr>
+        <w:t xml:space="preserve"> explicado pelo clima. Quatro formas de patamar foram comparadas, todas calculadas apenas com safras anteriores à prevista: reta de tendência estadual com todo o histórico, média móvel dos últimos 5 anos do município, média olímpica dos últimos 5 anos (descartando o melhor e o pior ano) e reta dos últimos 10 anos. A média móvel de 5 anos teve o melhor desempenho e foi adotada.</w:t>
       </w:r>
     </w:p>
     <w:p>
@@ -2900,7 +3028,74 @@
           <w:sz w:val="24"/>
           <w:szCs w:val="24"/>
         </w:rPr>
-        <w:t xml:space="preserve">A base de modelagem tem 5.260 pares município–safra (448 municípios, safras 2005–2025) com rendimento, patamar e todas as variáveis climáticas. Foram usadas duas validações: (i) </w:t>
+        <w:t xml:space="preserve">O desvio foi modelado por: (F) regressão linear reduzida, com uma variável por fenômeno – chuva de out–nov, chuva de dez–fev e seu quadrado, chuva de março, dias de calor e umidade mínima de dez–fev; (H1) F acrescida do déficit hídrico; (H2) H1 acrescida de dois termos de seca extrema, max(0, U</w:t>
+      </w:r>
+      <w:r>
+        <w:rPr>
+          <w:sz w:val="24"/>
+          <w:szCs w:val="24"/>
+          <w:vertAlign w:val="subscript"/>
+        </w:rPr>
+        <w:t xml:space="preserve">20</w:t>
+      </w:r>
+      <w:r>
+        <w:rPr>
+          <w:sz w:val="24"/>
+          <w:szCs w:val="24"/>
+        </w:rPr>
+        <w:t xml:space="preserve"> − U) e max(0, D − D</w:t>
+      </w:r>
+      <w:r>
+        <w:rPr>
+          <w:sz w:val="24"/>
+          <w:szCs w:val="24"/>
+          <w:vertAlign w:val="subscript"/>
+        </w:rPr>
+        <w:t xml:space="preserve">80</w:t>
+      </w:r>
+      <w:r>
+        <w:rPr>
+          <w:sz w:val="24"/>
+          <w:szCs w:val="24"/>
+        </w:rPr>
+        <w:t xml:space="preserve">), em que U é a umidade mínima, D o déficit hídrico e U</w:t>
+      </w:r>
+      <w:r>
+        <w:rPr>
+          <w:sz w:val="24"/>
+          <w:szCs w:val="24"/>
+          <w:vertAlign w:val="subscript"/>
+        </w:rPr>
+        <w:t xml:space="preserve">20</w:t>
+      </w:r>
+      <w:r>
+        <w:rPr>
+          <w:sz w:val="24"/>
+          <w:szCs w:val="24"/>
+        </w:rPr>
+        <w:t xml:space="preserve"> e D</w:t>
+      </w:r>
+      <w:r>
+        <w:rPr>
+          <w:sz w:val="24"/>
+          <w:szCs w:val="24"/>
+          <w:vertAlign w:val="subscript"/>
+        </w:rPr>
+        <w:t xml:space="preserve">80</w:t>
+      </w:r>
+      <w:r>
+        <w:rPr>
+          <w:sz w:val="24"/>
+          <w:szCs w:val="24"/>
+        </w:rPr>
+        <w:t xml:space="preserve"> os níveis que delimitam as 20% safras mais secas do treino – esses termos valem zero em safras normais e permitem que a perda cresça mais rápido na seca forte; (GB) Gradient Boosting com todas as variáveis climáticas, o ONI e as do balanço hídrico; </w:t>
+      </w:r>
+      <w:r>
+        <w:rPr>
+          <w:sz w:val="24"/>
+          <w:szCs w:val="24"/>
+        </w:rPr>
+        <w:t xml:space="preserve">e a média simples de H2 e GB. Na Etapa 5, como F e H2 empataram com o clima do NASA POWER, foram testadas combinações dos dois: a média de F e H2, uma regressão Ridge com as variáveis do H2 (penalização escolhida por validação cruzada dentro do treino) e o F acrescido de apenas um dos termos de seca extrema – o de umidade ou o de déficit. Esta última variação, denominada </w:t>
       </w:r>
       <w:r>
         <w:rPr>
@@ -2909,15 +3104,43 @@
           <w:sz w:val="24"/>
           <w:szCs w:val="24"/>
         </w:rPr>
-        <w:t xml:space="preserve">corte temporal</w:t>
-      </w:r>
-      <w:r>
-        <w:rPr>
-          <w:sz w:val="24"/>
-          <w:szCs w:val="24"/>
-        </w:rPr>
-        <w:t xml:space="preserve">, com treino até 2020 (3.669 linhas) e teste em 2021–2025 (1.591 linhas), que simula a previsão real nas safras mais recentes; e (ii) </w:t>
-      </w:r>
+        <w:t xml:space="preserve">FL</w:t>
+      </w:r>
+      <w:r>
+        <w:rPr>
+          <w:sz w:val="24"/>
+          <w:szCs w:val="24"/>
+        </w:rPr>
+        <w:t xml:space="preserve"> (F + max(0, D − D</w:t>
+      </w:r>
+      <w:r>
+        <w:rPr>
+          <w:sz w:val="24"/>
+          <w:szCs w:val="24"/>
+          <w:vertAlign w:val="subscript"/>
+        </w:rPr>
+        <w:t xml:space="preserve">80</w:t>
+      </w:r>
+      <w:r>
+        <w:rPr>
+          <w:sz w:val="24"/>
+          <w:szCs w:val="24"/>
+        </w:rPr>
+        <w:t xml:space="preserve">)), foi a melhor de forma consistente e é o modelo final. Random Forest (500 árvores) foi avaliado nas primeiras etapas.</w:t>
+      </w:r>
+      <w:r>
+        <w:rPr>
+          <w:sz w:val="24"/>
+          <w:szCs w:val="24"/>
+        </w:rPr>
+        <w:t xml:space="preserve"> Os hiperparâmetros das árvores foram fixados a priori (Gradient Boosting: taxa de aprendizado 0,05, até 500 iterações com parada antecipada). As linhas de base são a média histórica do município (todas as safras anteriores) e o rendimento da safra anterior. O modelo usa apenas informações disponíveis até o fim de março (a chuva de março é a última variável), permitindo a previsão cerca de um mês antes da colheita (abril–maio).</w:t>
+      </w:r>
+    </w:p>
+    <w:p>
+      <w:pPr>
+        <w:keepNext/>
+        <w:spacing w:before="280" w:after="160"/>
+      </w:pPr>
       <w:r>
         <w:rPr>
           <w:b/>
@@ -2925,6 +3148,45 @@
           <w:sz w:val="24"/>
           <w:szCs w:val="24"/>
         </w:rPr>
+        <w:t xml:space="preserve">5.4 Validação e métricas</w:t>
+      </w:r>
+    </w:p>
+    <w:p>
+      <w:pPr>
+        <w:spacing w:after="200" w:line="276" w:lineRule="auto"/>
+        <w:ind w:firstLine="720"/>
+        <w:jc w:val="both"/>
+      </w:pPr>
+      <w:r>
+        <w:rPr>
+          <w:sz w:val="24"/>
+          <w:szCs w:val="24"/>
+        </w:rPr>
+        <w:t xml:space="preserve">Com o clima do NASA POWER, a base de modelagem tem 8.651 pares município–safra (450 municípios, safras 2005–2025) – todos os pares com rendimento e patamar –, contra 5.260 pares (448 municípios) com o clima das estações do INMET. Foram usadas duas validações: (i) </w:t>
+      </w:r>
+      <w:r>
+        <w:rPr>
+          <w:b/>
+          <w:bCs/>
+          <w:sz w:val="24"/>
+          <w:szCs w:val="24"/>
+        </w:rPr>
+        <w:t xml:space="preserve">corte temporal</w:t>
+      </w:r>
+      <w:r>
+        <w:rPr>
+          <w:sz w:val="24"/>
+          <w:szCs w:val="24"/>
+        </w:rPr>
+        <w:t xml:space="preserve">, com treino até 2020 (6.497 linhas) e teste em 2021–2025 (2.154 linhas), que simula a previsão real nas safras mais recentes; e (ii) </w:t>
+      </w:r>
+      <w:r>
+        <w:rPr>
+          <w:b/>
+          <w:bCs/>
+          <w:sz w:val="24"/>
+          <w:szCs w:val="24"/>
+        </w:rPr>
         <w:t xml:space="preserve">deixando uma safra de fora</w:t>
       </w:r>
       <w:r>
@@ -2932,7 +3194,7 @@
           <w:sz w:val="24"/>
           <w:szCs w:val="24"/>
         </w:rPr>
-        <w:t xml:space="preserve">, em que cada safra de 2008 a 2025 é prevista por um modelo treinado com todas as demais (5.125 linhas avaliadas), medindo a estabilidade da relação clima–rendimento. As métricas são RMSE, MAE, R</w:t>
+        <w:t xml:space="preserve">, em que cada safra de 2008 a 2025 é prevista por um modelo treinado com todas as demais (7.472 linhas avaliadas), medindo a estabilidade da relação clima–rendimento. As métricas são RMSE, MAE, R</w:t>
       </w:r>
       <w:r>
         <w:rPr>
@@ -2990,7 +3252,21 @@
           <w:sz w:val="24"/>
           <w:szCs w:val="24"/>
         </w:rPr>
-        <w:t xml:space="preserve">A Tabela 3 resume as quatro etapas. Na Etapa 1, nenhum modelo superou a média do período de teste (R</w:t>
+        <w:t xml:space="preserve">A Tabela 3 </w:t>
+      </w:r>
+      <w:r>
+        <w:rPr>
+          <w:sz w:val="24"/>
+          <w:szCs w:val="24"/>
+        </w:rPr>
+        <w:t xml:space="preserve">resume as cinco etapas</w:t>
+      </w:r>
+      <w:r>
+        <w:rPr>
+          <w:sz w:val="24"/>
+          <w:szCs w:val="24"/>
+        </w:rPr>
+        <w:t xml:space="preserve">. Na Etapa 1, nenhum modelo superou a média do período de teste (R</w:t>
       </w:r>
       <w:r>
         <w:rPr>
@@ -3020,7 +3296,14 @@
           <w:sz w:val="24"/>
           <w:szCs w:val="24"/>
         </w:rPr>
-        <w:t xml:space="preserve"> de 0,44, valor otimista porque a tendência usava safras posteriores à prevista; com o patamar calculado apenas com o passado (Etapa 3), o valor realista é ≈0,25.</w:t>
+        <w:t xml:space="preserve"> de 0,44, valor otimista porque a tendência usava safras posteriores à prevista; com o patamar calculado apenas com o passado (Etapa 3), </w:t>
+      </w:r>
+      <w:r>
+        <w:rPr>
+          <w:sz w:val="24"/>
+          <w:szCs w:val="24"/>
+        </w:rPr>
+        <w:t xml:space="preserve">o valor realista é ≈0,25. Na Etapa 4, o balanço hídrico e os limiares de seca extrema (H2) trouxeram um ganho pequeno. Na Etapa 5, a troca das estações pelo NASA POWER ampliou a base em 64% e reduziu o erro nos mesmos pares, e o modelo FL passou a ser o final.</w:t>
       </w:r>
     </w:p>
     <w:tbl>
@@ -3387,7 +3670,78 @@
                 <w:sz w:val="22"/>
                 <w:szCs w:val="22"/>
               </w:rPr>
-              <w:t xml:space="preserve">RMSE 740 / 684 (modelo final, H2).</w:t>
+              <w:t xml:space="preserve">RMSE 740 / 684 (H2).</w:t>
+            </w:r>
+          </w:p>
+        </w:tc>
+      </w:tr>
+      <w:tr>
+        <w:tc>
+          <w:tcPr>
+            <w:tcW w:w="1000" w:type="dxa"/>
+            <w:tcMar>
+              <w:top w:w="80" w:type="dxa"/>
+              <w:left w:w="100" w:type="dxa"/>
+              <w:bottom w:w="80" w:type="dxa"/>
+              <w:right w:w="100" w:type="dxa"/>
+            </w:tcMar>
+          </w:tcPr>
+          <w:p>
+            <w:pPr>
+              <w:keepNext/>
+            </w:pPr>
+            <w:r>
+              <w:rPr>
+                <w:sz w:val="22"/>
+                <w:szCs w:val="22"/>
+              </w:rPr>
+              <w:t xml:space="preserve">5</w:t>
+            </w:r>
+          </w:p>
+        </w:tc>
+        <w:tc>
+          <w:tcPr>
+            <w:tcW w:w="3200" w:type="dxa"/>
+            <w:tcMar>
+              <w:top w:w="80" w:type="dxa"/>
+              <w:left w:w="100" w:type="dxa"/>
+              <w:bottom w:w="80" w:type="dxa"/>
+              <w:right w:w="100" w:type="dxa"/>
+            </w:tcMar>
+          </w:tcPr>
+          <w:p>
+            <w:pPr>
+              <w:keepNext/>
+            </w:pPr>
+            <w:r>
+              <w:rPr>
+                <w:sz w:val="22"/>
+                <w:szCs w:val="22"/>
+              </w:rPr>
+              <w:t xml:space="preserve">Clima do NASA POWER (8.651 pares, +64%) e combinações de F e H2</w:t>
+            </w:r>
+          </w:p>
+        </w:tc>
+        <w:tc>
+          <w:tcPr>
+            <w:tcW w:w="4300" w:type="dxa"/>
+            <w:tcMar>
+              <w:top w:w="80" w:type="dxa"/>
+              <w:left w:w="100" w:type="dxa"/>
+              <w:bottom w:w="80" w:type="dxa"/>
+              <w:right w:w="100" w:type="dxa"/>
+            </w:tcMar>
+          </w:tcPr>
+          <w:p>
+            <w:pPr>
+              <w:keepNext/>
+            </w:pPr>
+            <w:r>
+              <w:rPr>
+                <w:sz w:val="22"/>
+                <w:szCs w:val="22"/>
+              </w:rPr>
+              <w:t xml:space="preserve">RMSE 739 / 638 (modelo final, FL).</w:t>
             </w:r>
           </w:p>
         </w:tc>
@@ -3431,10 +3785,433 @@
       </w:pPr>
       <w:r>
         <w:rPr>
-          <w:sz w:val="24"/>
-          <w:szCs w:val="24"/>
-        </w:rPr>
-        <w:t xml:space="preserve">A Tabela 4 compara os modelos nas duas validações. O modelo final (H2) reduziu o RMSE em 14% (corte temporal) e 22% (deixando uma safra de fora) em relação à média histórica do município, com MAE de 591 e 518 kg/ha. Repetir o rendimento da safra anterior foi a pior estratégia, pois propaga secas e recordes para a previsão seguinte. O déficit hídrico sozinho (H1) não melhorou o modelo, por medir a mesma seca que a chuva e a umidade de dez–fev (correlação ≈0,8 entre elas); o ganho veio dos limiares de seca extrema. Os modelos de árvores ficaram atrás da regressão linear em todos os cenários: Random Forest teve desempenho semelhante ou inferior ao do Gradient Boosting nas Etapas 1 e 2 e não foi levado adiante, e a combinação de H2 com Gradient Boosting foi melhor em uma validação e pior na outra.</w:t>
+          <w:b/>
+          <w:bCs/>
+          <w:sz w:val="24"/>
+          <w:szCs w:val="24"/>
+        </w:rPr>
+        <w:t xml:space="preserve">Fonte do clima.</w:t>
+      </w:r>
+      <w:r>
+        <w:rPr>
+          <w:sz w:val="24"/>
+          <w:szCs w:val="24"/>
+        </w:rPr>
+        <w:t xml:space="preserve"> Comparando cada estação do INMET com a célula do NASA POWER que a contém, a correlação entre safras ficou entre 0,78 e 0,89 para quase todas as variáveis (0,74 a 0,94 na média estadual de cada safra); a exceção foi a maior sequência de dias secos (0,53). Nos mesmos 5.260 pares município–safra, o clima do NASA POWER reduziu o erro de todos os modelos lineares (Tabela 4). Uma explicação provável é que a célula da grade (≈50 km) representa a média da área do município melhor que uma estação pontual, às vezes a dezenas de quilômetros, e não tem falhas a preencher.</w:t>
+      </w:r>
+    </w:p>
+    <w:tbl>
+      <w:tblPr>
+        <w:tblW w:w="8500" w:type="dxa"/>
+        <w:jc w:val="center"/>
+        <w:tblBorders>
+          <w:top w:val="single" w:sz="4" w:space="0" w:color="999999"/>
+          <w:left w:val="single" w:sz="4" w:space="0" w:color="999999"/>
+          <w:bottom w:val="single" w:sz="4" w:space="0" w:color="999999"/>
+          <w:right w:val="single" w:sz="4" w:space="0" w:color="999999"/>
+          <w:insideH w:val="single" w:sz="4" w:space="0" w:color="999999"/>
+          <w:insideV w:val="single" w:sz="4" w:space="0" w:color="999999"/>
+        </w:tblBorders>
+        <w:tblCellMar>
+          <w:left w:w="10" w:type="dxa"/>
+          <w:right w:w="10" w:type="dxa"/>
+        </w:tblCellMar>
+        <w:tblLook w:val="04A0" w:firstRow="1" w:lastRow="0" w:firstColumn="1" w:lastColumn="0" w:noHBand="0" w:noVBand="1"/>
+      </w:tblPr>
+      <w:tblGrid>
+        <w:gridCol w:w="3700"/>
+        <w:gridCol w:w="2400"/>
+        <w:gridCol w:w="2400"/>
+      </w:tblGrid>
+      <w:tr>
+        <w:trPr>
+          <w:tblHeader/>
+        </w:trPr>
+        <w:tc>
+          <w:tcPr>
+            <w:tcW w:w="3700" w:type="dxa"/>
+            <w:shd w:val="clear" w:color="auto" w:fill="D9D9D9"/>
+            <w:tcMar>
+              <w:top w:w="80" w:type="dxa"/>
+              <w:left w:w="100" w:type="dxa"/>
+              <w:bottom w:w="80" w:type="dxa"/>
+              <w:right w:w="100" w:type="dxa"/>
+            </w:tcMar>
+          </w:tcPr>
+          <w:p>
+            <w:r>
+              <w:rPr>
+                <w:b/>
+                <w:bCs/>
+                <w:sz w:val="22"/>
+                <w:szCs w:val="22"/>
+              </w:rPr>
+              <w:t xml:space="preserve">Modelo</w:t>
+            </w:r>
+          </w:p>
+        </w:tc>
+        <w:tc>
+          <w:tcPr>
+            <w:tcW w:w="2400" w:type="dxa"/>
+            <w:shd w:val="clear" w:color="auto" w:fill="D9D9D9"/>
+            <w:tcMar>
+              <w:top w:w="80" w:type="dxa"/>
+              <w:left w:w="100" w:type="dxa"/>
+              <w:bottom w:w="80" w:type="dxa"/>
+              <w:right w:w="100" w:type="dxa"/>
+            </w:tcMar>
+          </w:tcPr>
+          <w:p>
+            <w:pPr>
+              <w:jc w:val="center"/>
+            </w:pPr>
+            <w:r>
+              <w:rPr>
+                <w:b/>
+                <w:bCs/>
+                <w:sz w:val="22"/>
+                <w:szCs w:val="22"/>
+              </w:rPr>
+              <w:t xml:space="preserve">INMET</w:t>
+            </w:r>
+          </w:p>
+        </w:tc>
+        <w:tc>
+          <w:tcPr>
+            <w:tcW w:w="2400" w:type="dxa"/>
+            <w:shd w:val="clear" w:color="auto" w:fill="D9D9D9"/>
+            <w:tcMar>
+              <w:top w:w="80" w:type="dxa"/>
+              <w:left w:w="100" w:type="dxa"/>
+              <w:bottom w:w="80" w:type="dxa"/>
+              <w:right w:w="100" w:type="dxa"/>
+            </w:tcMar>
+          </w:tcPr>
+          <w:p>
+            <w:pPr>
+              <w:jc w:val="center"/>
+            </w:pPr>
+            <w:r>
+              <w:rPr>
+                <w:b/>
+                <w:bCs/>
+                <w:sz w:val="22"/>
+                <w:szCs w:val="22"/>
+              </w:rPr>
+              <w:t xml:space="preserve">NASA POWER</w:t>
+            </w:r>
+          </w:p>
+        </w:tc>
+      </w:tr>
+      <w:tr>
+        <w:tc>
+          <w:tcPr>
+            <w:tcW w:w="3700" w:type="dxa"/>
+            <w:tcMar>
+              <w:top w:w="80" w:type="dxa"/>
+              <w:left w:w="100" w:type="dxa"/>
+              <w:bottom w:w="80" w:type="dxa"/>
+              <w:right w:w="100" w:type="dxa"/>
+            </w:tcMar>
+          </w:tcPr>
+          <w:p>
+            <w:r>
+              <w:rPr>
+                <w:sz w:val="22"/>
+                <w:szCs w:val="22"/>
+              </w:rPr>
+              <w:t xml:space="preserve">F – Regressão linear reduzida</w:t>
+            </w:r>
+          </w:p>
+        </w:tc>
+        <w:tc>
+          <w:tcPr>
+            <w:tcW w:w="2400" w:type="dxa"/>
+            <w:tcMar>
+              <w:top w:w="80" w:type="dxa"/>
+              <w:left w:w="100" w:type="dxa"/>
+              <w:bottom w:w="80" w:type="dxa"/>
+              <w:right w:w="100" w:type="dxa"/>
+            </w:tcMar>
+          </w:tcPr>
+          <w:p>
+            <w:pPr>
+              <w:jc w:val="center"/>
+            </w:pPr>
+            <w:r>
+              <w:rPr>
+                <w:sz w:val="22"/>
+                <w:szCs w:val="22"/>
+              </w:rPr>
+              <w:t xml:space="preserve">767 / 689</w:t>
+            </w:r>
+          </w:p>
+        </w:tc>
+        <w:tc>
+          <w:tcPr>
+            <w:tcW w:w="2400" w:type="dxa"/>
+            <w:tcMar>
+              <w:top w:w="80" w:type="dxa"/>
+              <w:left w:w="100" w:type="dxa"/>
+              <w:bottom w:w="80" w:type="dxa"/>
+              <w:right w:w="100" w:type="dxa"/>
+            </w:tcMar>
+          </w:tcPr>
+          <w:p>
+            <w:pPr>
+              <w:jc w:val="center"/>
+            </w:pPr>
+            <w:r>
+              <w:rPr>
+                <w:sz w:val="22"/>
+                <w:szCs w:val="22"/>
+              </w:rPr>
+              <w:t xml:space="preserve">709 / 643</w:t>
+            </w:r>
+          </w:p>
+        </w:tc>
+      </w:tr>
+      <w:tr>
+        <w:tc>
+          <w:tcPr>
+            <w:tcW w:w="3700" w:type="dxa"/>
+            <w:tcMar>
+              <w:top w:w="80" w:type="dxa"/>
+              <w:left w:w="100" w:type="dxa"/>
+              <w:bottom w:w="80" w:type="dxa"/>
+              <w:right w:w="100" w:type="dxa"/>
+            </w:tcMar>
+          </w:tcPr>
+          <w:p>
+            <w:r>
+              <w:rPr>
+                <w:sz w:val="22"/>
+                <w:szCs w:val="22"/>
+              </w:rPr>
+              <w:t xml:space="preserve">H2 – F + déficit + dois limiares</w:t>
+            </w:r>
+          </w:p>
+        </w:tc>
+        <w:tc>
+          <w:tcPr>
+            <w:tcW w:w="2400" w:type="dxa"/>
+            <w:tcMar>
+              <w:top w:w="80" w:type="dxa"/>
+              <w:left w:w="100" w:type="dxa"/>
+              <w:bottom w:w="80" w:type="dxa"/>
+              <w:right w:w="100" w:type="dxa"/>
+            </w:tcMar>
+          </w:tcPr>
+          <w:p>
+            <w:pPr>
+              <w:jc w:val="center"/>
+            </w:pPr>
+            <w:r>
+              <w:rPr>
+                <w:sz w:val="22"/>
+                <w:szCs w:val="22"/>
+              </w:rPr>
+              <w:t xml:space="preserve">740 / 684</w:t>
+            </w:r>
+          </w:p>
+        </w:tc>
+        <w:tc>
+          <w:tcPr>
+            <w:tcW w:w="2400" w:type="dxa"/>
+            <w:tcMar>
+              <w:top w:w="80" w:type="dxa"/>
+              <w:left w:w="100" w:type="dxa"/>
+              <w:bottom w:w="80" w:type="dxa"/>
+              <w:right w:w="100" w:type="dxa"/>
+            </w:tcMar>
+          </w:tcPr>
+          <w:p>
+            <w:pPr>
+              <w:jc w:val="center"/>
+            </w:pPr>
+            <w:r>
+              <w:rPr>
+                <w:sz w:val="22"/>
+                <w:szCs w:val="22"/>
+              </w:rPr>
+              <w:t xml:space="preserve">700 / 656</w:t>
+            </w:r>
+          </w:p>
+        </w:tc>
+      </w:tr>
+      <w:tr>
+        <w:tc>
+          <w:tcPr>
+            <w:tcW w:w="3700" w:type="dxa"/>
+            <w:tcMar>
+              <w:top w:w="80" w:type="dxa"/>
+              <w:left w:w="100" w:type="dxa"/>
+              <w:bottom w:w="80" w:type="dxa"/>
+              <w:right w:w="100" w:type="dxa"/>
+            </w:tcMar>
+          </w:tcPr>
+          <w:p>
+            <w:r>
+              <w:rPr>
+                <w:sz w:val="22"/>
+                <w:szCs w:val="22"/>
+              </w:rPr>
+              <w:t xml:space="preserve">FL – F + limiar de déficit</w:t>
+            </w:r>
+          </w:p>
+        </w:tc>
+        <w:tc>
+          <w:tcPr>
+            <w:tcW w:w="2400" w:type="dxa"/>
+            <w:tcMar>
+              <w:top w:w="80" w:type="dxa"/>
+              <w:left w:w="100" w:type="dxa"/>
+              <w:bottom w:w="80" w:type="dxa"/>
+              <w:right w:w="100" w:type="dxa"/>
+            </w:tcMar>
+          </w:tcPr>
+          <w:p>
+            <w:pPr>
+              <w:jc w:val="center"/>
+            </w:pPr>
+            <w:r>
+              <w:rPr>
+                <w:sz w:val="22"/>
+                <w:szCs w:val="22"/>
+              </w:rPr>
+              <w:t xml:space="preserve">735 / 678</w:t>
+            </w:r>
+          </w:p>
+        </w:tc>
+        <w:tc>
+          <w:tcPr>
+            <w:tcW w:w="2400" w:type="dxa"/>
+            <w:tcMar>
+              <w:top w:w="80" w:type="dxa"/>
+              <w:left w:w="100" w:type="dxa"/>
+              <w:bottom w:w="80" w:type="dxa"/>
+              <w:right w:w="100" w:type="dxa"/>
+            </w:tcMar>
+          </w:tcPr>
+          <w:p>
+            <w:pPr>
+              <w:jc w:val="center"/>
+            </w:pPr>
+            <w:r>
+              <w:rPr>
+                <w:sz w:val="22"/>
+                <w:szCs w:val="22"/>
+              </w:rPr>
+              <w:t xml:space="preserve">698 / 651</w:t>
+            </w:r>
+          </w:p>
+        </w:tc>
+      </w:tr>
+      <w:tr>
+        <w:tc>
+          <w:tcPr>
+            <w:tcW w:w="3700" w:type="dxa"/>
+            <w:tcMar>
+              <w:top w:w="80" w:type="dxa"/>
+              <w:left w:w="100" w:type="dxa"/>
+              <w:bottom w:w="80" w:type="dxa"/>
+              <w:right w:w="100" w:type="dxa"/>
+            </w:tcMar>
+          </w:tcPr>
+          <w:p>
+            <w:r>
+              <w:rPr>
+                <w:sz w:val="22"/>
+                <w:szCs w:val="22"/>
+              </w:rPr>
+              <w:t xml:space="preserve">GB – Gradient Boosting</w:t>
+            </w:r>
+          </w:p>
+        </w:tc>
+        <w:tc>
+          <w:tcPr>
+            <w:tcW w:w="2400" w:type="dxa"/>
+            <w:tcMar>
+              <w:top w:w="80" w:type="dxa"/>
+              <w:left w:w="100" w:type="dxa"/>
+              <w:bottom w:w="80" w:type="dxa"/>
+              <w:right w:w="100" w:type="dxa"/>
+            </w:tcMar>
+          </w:tcPr>
+          <w:p>
+            <w:pPr>
+              <w:jc w:val="center"/>
+            </w:pPr>
+            <w:r>
+              <w:rPr>
+                <w:sz w:val="22"/>
+                <w:szCs w:val="22"/>
+              </w:rPr>
+              <w:t xml:space="preserve">811 / 738</w:t>
+            </w:r>
+          </w:p>
+        </w:tc>
+        <w:tc>
+          <w:tcPr>
+            <w:tcW w:w="2400" w:type="dxa"/>
+            <w:tcMar>
+              <w:top w:w="80" w:type="dxa"/>
+              <w:left w:w="100" w:type="dxa"/>
+              <w:bottom w:w="80" w:type="dxa"/>
+              <w:right w:w="100" w:type="dxa"/>
+            </w:tcMar>
+          </w:tcPr>
+          <w:p>
+            <w:pPr>
+              <w:jc w:val="center"/>
+            </w:pPr>
+            <w:r>
+              <w:rPr>
+                <w:sz w:val="22"/>
+                <w:szCs w:val="22"/>
+              </w:rPr>
+              <w:t xml:space="preserve">854 / 683</w:t>
+            </w:r>
+          </w:p>
+        </w:tc>
+      </w:tr>
+    </w:tbl>
+    <w:p>
+      <w:pPr>
+        <w:spacing w:before="120" w:after="300"/>
+        <w:jc w:val="center"/>
+      </w:pPr>
+      <w:r>
+        <w:rPr>
+          <w:i/>
+          <w:iCs/>
+          <w:sz w:val="22"/>
+          <w:szCs w:val="22"/>
+        </w:rPr>
+        <w:t xml:space="preserve">Tabela 4 – Mesmos 5.260 pares município–safra, clima das estações do INMET × clima do NASA POWER. RMSE em kg/ha (corte temporal / deixando uma safra de fora). Fonte: elaboração própria (2026).</w:t>
+      </w:r>
+    </w:p>
+    <w:p>
+      <w:pPr>
+        <w:spacing w:after="200" w:line="276" w:lineRule="auto"/>
+        <w:ind w:firstLine="720"/>
+        <w:jc w:val="both"/>
+      </w:pPr>
+      <w:r>
+        <w:rPr>
+          <w:b/>
+          <w:bCs/>
+          <w:sz w:val="24"/>
+          <w:szCs w:val="24"/>
+        </w:rPr>
+        <w:t xml:space="preserve">Modelo final.</w:t>
+      </w:r>
+      <w:r>
+        <w:rPr>
+          <w:sz w:val="24"/>
+          <w:szCs w:val="24"/>
+        </w:rPr>
+        <w:t xml:space="preserve"> A Tabela 5 compara os modelos com o NASA POWER em todos os 8.651 pares. O modelo final (FL) reduziu o RMSE em 16% (corte temporal) e 28% (deixando uma safra de fora) em relação à média histórica do município, com MAE de 580 e 479 kg/ha. Com essa fonte, F e H2 empataram (RMSE médio de 702 e 705 kg/ha nas duas validações), e por isso foram testadas combinações dos dois. O FL foi o melhor ou o segundo melhor nos três cenários avaliados – estações do INMET, NASA POWER nos mesmos pares e NASA POWER em todos os pares –, enquanto a média de F e H2 e a regressão Ridge não melhoraram em relação ao F. Como seis variações foram testadas nos mesmos dados, o resultado deve ser lido com cautela: o ganho do FL sobre o F é modesto (≈2% no RMSE médio) e concentrado no período 2021–2025, que teve as secas mais fortes da série, mas é consistente entre cenários e fontes. Ele também explica o desempenho do H2: o termo de déficit “normal” repete a informação da chuva e da umidade de dez–fev (correlação ≈0,8 entre elas), e o que acrescenta é apenas o limiar de seca extrema. Repetir o rendimento da safra anterior foi a pior estratégia, pois propaga secas e recordes para a previsão seguinte. Os modelos de árvores ficaram atrás da regressão linear: Random Forest teve desempenho semelhante ou inferior ao do Gradient Boosting nas Etapas 1 e 2 e não foi levado adiante.</w:t>
       </w:r>
     </w:p>
     <w:tbl>
@@ -3728,7 +4505,7 @@
                 <w:sz w:val="22"/>
                 <w:szCs w:val="22"/>
               </w:rPr>
-              <w:t xml:space="preserve">1.276</w:t>
+              <w:t xml:space="preserve">1.366</w:t>
             </w:r>
           </w:p>
         </w:tc>
@@ -3751,7 +4528,7 @@
                 <w:sz w:val="22"/>
                 <w:szCs w:val="22"/>
               </w:rPr>
-              <w:t xml:space="preserve">−1,05</w:t>
+              <w:t xml:space="preserve">−1,26</w:t>
             </w:r>
           </w:p>
         </w:tc>
@@ -3774,7 +4551,7 @@
                 <w:sz w:val="22"/>
                 <w:szCs w:val="22"/>
               </w:rPr>
-              <w:t xml:space="preserve">979</w:t>
+              <w:t xml:space="preserve">999</w:t>
             </w:r>
           </w:p>
         </w:tc>
@@ -3797,7 +4574,7 @@
                 <w:sz w:val="22"/>
                 <w:szCs w:val="22"/>
               </w:rPr>
-              <w:t xml:space="preserve">−0,51</w:t>
+              <w:t xml:space="preserve">−0,52</w:t>
             </w:r>
           </w:p>
         </w:tc>
@@ -3842,7 +4619,7 @@
                 <w:sz w:val="22"/>
                 <w:szCs w:val="22"/>
               </w:rPr>
-              <w:t xml:space="preserve">861</w:t>
+              <w:t xml:space="preserve">877</w:t>
             </w:r>
           </w:p>
         </w:tc>
@@ -3888,7 +4665,7 @@
                 <w:sz w:val="22"/>
                 <w:szCs w:val="22"/>
               </w:rPr>
-              <w:t xml:space="preserve">877</w:t>
+              <w:t xml:space="preserve">881</w:t>
             </w:r>
           </w:p>
         </w:tc>
@@ -3911,7 +4688,7 @@
                 <w:sz w:val="22"/>
                 <w:szCs w:val="22"/>
               </w:rPr>
-              <w:t xml:space="preserve">−0,21</w:t>
+              <w:t xml:space="preserve">−0,18</w:t>
             </w:r>
           </w:p>
         </w:tc>
@@ -3956,7 +4733,7 @@
                 <w:sz w:val="22"/>
                 <w:szCs w:val="22"/>
               </w:rPr>
-              <w:t xml:space="preserve">813</w:t>
+              <w:t xml:space="preserve">857</w:t>
             </w:r>
           </w:p>
         </w:tc>
@@ -3979,7 +4756,7 @@
                 <w:sz w:val="22"/>
                 <w:szCs w:val="22"/>
               </w:rPr>
-              <w:t xml:space="preserve">0,17</w:t>
+              <w:t xml:space="preserve">0,11</w:t>
             </w:r>
           </w:p>
         </w:tc>
@@ -4002,7 +4779,7 @@
                 <w:sz w:val="22"/>
                 <w:szCs w:val="22"/>
               </w:rPr>
-              <w:t xml:space="preserve">721</w:t>
+              <w:t xml:space="preserve">657</w:t>
             </w:r>
           </w:p>
         </w:tc>
@@ -4025,7 +4802,7 @@
                 <w:sz w:val="22"/>
                 <w:szCs w:val="22"/>
               </w:rPr>
-              <w:t xml:space="preserve">0,18</w:t>
+              <w:t xml:space="preserve">0,34</w:t>
             </w:r>
           </w:p>
         </w:tc>
@@ -4047,7 +4824,7 @@
                 <w:sz w:val="22"/>
                 <w:szCs w:val="22"/>
               </w:rPr>
-              <w:t xml:space="preserve">H1 – F + déficit hídrico</w:t>
+              <w:t xml:space="preserve">H2 – F + déficit + dois limiares</w:t>
             </w:r>
           </w:p>
         </w:tc>
@@ -4070,7 +4847,7 @@
                 <w:sz w:val="22"/>
                 <w:szCs w:val="22"/>
               </w:rPr>
-              <w:t xml:space="preserve">777</w:t>
+              <w:t xml:space="preserve">762</w:t>
             </w:r>
           </w:p>
         </w:tc>
@@ -4093,7 +4870,7 @@
                 <w:sz w:val="22"/>
                 <w:szCs w:val="22"/>
               </w:rPr>
-              <w:t xml:space="preserve">0,24</w:t>
+              <w:t xml:space="preserve">0,30</w:t>
             </w:r>
           </w:p>
         </w:tc>
@@ -4116,7 +4893,7 @@
                 <w:sz w:val="22"/>
                 <w:szCs w:val="22"/>
               </w:rPr>
-              <w:t xml:space="preserve">688</w:t>
+              <w:t xml:space="preserve">648</w:t>
             </w:r>
           </w:p>
         </w:tc>
@@ -4139,7 +4916,7 @@
                 <w:sz w:val="22"/>
                 <w:szCs w:val="22"/>
               </w:rPr>
-              <w:t xml:space="preserve">0,25</w:t>
+              <w:t xml:space="preserve">0,36</w:t>
             </w:r>
           </w:p>
         </w:tc>
@@ -4184,7 +4961,7 @@
                 <w:sz w:val="22"/>
                 <w:szCs w:val="22"/>
               </w:rPr>
-              <w:t xml:space="preserve">767</w:t>
+              <w:t xml:space="preserve">765</w:t>
             </w:r>
           </w:p>
         </w:tc>
@@ -4207,7 +4984,7 @@
                 <w:sz w:val="22"/>
                 <w:szCs w:val="22"/>
               </w:rPr>
-              <w:t xml:space="preserve">0,26</w:t>
+              <w:t xml:space="preserve">0,29</w:t>
             </w:r>
           </w:p>
         </w:tc>
@@ -4230,7 +5007,7 @@
                 <w:sz w:val="22"/>
                 <w:szCs w:val="22"/>
               </w:rPr>
-              <w:t xml:space="preserve">689</w:t>
+              <w:t xml:space="preserve">638</w:t>
             </w:r>
           </w:p>
         </w:tc>
@@ -4253,7 +5030,7 @@
                 <w:sz w:val="22"/>
                 <w:szCs w:val="22"/>
               </w:rPr>
-              <w:t xml:space="preserve">0,25</w:t>
+              <w:t xml:space="preserve">0,38</w:t>
             </w:r>
           </w:p>
         </w:tc>
@@ -4270,120 +5047,6 @@
             </w:tcMar>
           </w:tcPr>
           <w:p>
-            <w:r>
-              <w:rPr>
-                <w:sz w:val="22"/>
-                <w:szCs w:val="22"/>
-              </w:rPr>
-              <w:t xml:space="preserve">Média de H2 e GB</w:t>
-            </w:r>
-          </w:p>
-        </w:tc>
-        <w:tc>
-          <w:tcPr>
-            <w:tcW w:w="1200" w:type="dxa"/>
-            <w:tcMar>
-              <w:top w:w="80" w:type="dxa"/>
-              <w:left w:w="100" w:type="dxa"/>
-              <w:bottom w:w="80" w:type="dxa"/>
-              <w:right w:w="100" w:type="dxa"/>
-            </w:tcMar>
-          </w:tcPr>
-          <w:p>
-            <w:pPr>
-              <w:jc w:val="center"/>
-            </w:pPr>
-            <w:r>
-              <w:rPr>
-                <w:sz w:val="22"/>
-                <w:szCs w:val="22"/>
-              </w:rPr>
-              <w:t xml:space="preserve">755</w:t>
-            </w:r>
-          </w:p>
-        </w:tc>
-        <w:tc>
-          <w:tcPr>
-            <w:tcW w:w="1200" w:type="dxa"/>
-            <w:tcMar>
-              <w:top w:w="80" w:type="dxa"/>
-              <w:left w:w="100" w:type="dxa"/>
-              <w:bottom w:w="80" w:type="dxa"/>
-              <w:right w:w="100" w:type="dxa"/>
-            </w:tcMar>
-          </w:tcPr>
-          <w:p>
-            <w:pPr>
-              <w:jc w:val="center"/>
-            </w:pPr>
-            <w:r>
-              <w:rPr>
-                <w:sz w:val="22"/>
-                <w:szCs w:val="22"/>
-              </w:rPr>
-              <w:t xml:space="preserve">0,28</w:t>
-            </w:r>
-          </w:p>
-        </w:tc>
-        <w:tc>
-          <w:tcPr>
-            <w:tcW w:w="1200" w:type="dxa"/>
-            <w:tcMar>
-              <w:top w:w="80" w:type="dxa"/>
-              <w:left w:w="100" w:type="dxa"/>
-              <w:bottom w:w="80" w:type="dxa"/>
-              <w:right w:w="100" w:type="dxa"/>
-            </w:tcMar>
-          </w:tcPr>
-          <w:p>
-            <w:pPr>
-              <w:jc w:val="center"/>
-            </w:pPr>
-            <w:r>
-              <w:rPr>
-                <w:sz w:val="22"/>
-                <w:szCs w:val="22"/>
-              </w:rPr>
-              <w:t xml:space="preserve">677</w:t>
-            </w:r>
-          </w:p>
-        </w:tc>
-        <w:tc>
-          <w:tcPr>
-            <w:tcW w:w="1200" w:type="dxa"/>
-            <w:tcMar>
-              <w:top w:w="80" w:type="dxa"/>
-              <w:left w:w="100" w:type="dxa"/>
-              <w:bottom w:w="80" w:type="dxa"/>
-              <w:right w:w="100" w:type="dxa"/>
-            </w:tcMar>
-          </w:tcPr>
-          <w:p>
-            <w:pPr>
-              <w:jc w:val="center"/>
-            </w:pPr>
-            <w:r>
-              <w:rPr>
-                <w:sz w:val="22"/>
-                <w:szCs w:val="22"/>
-              </w:rPr>
-              <w:t xml:space="preserve">0,28</w:t>
-            </w:r>
-          </w:p>
-        </w:tc>
-      </w:tr>
-      <w:tr>
-        <w:tc>
-          <w:tcPr>
-            <w:tcW w:w="3700" w:type="dxa"/>
-            <w:tcMar>
-              <w:top w:w="80" w:type="dxa"/>
-              <w:left w:w="100" w:type="dxa"/>
-              <w:bottom w:w="80" w:type="dxa"/>
-              <w:right w:w="100" w:type="dxa"/>
-            </w:tcMar>
-          </w:tcPr>
-          <w:p>
             <w:pPr>
               <w:keepNext/>
             </w:pPr>
@@ -4394,7 +5057,7 @@
                 <w:sz w:val="22"/>
                 <w:szCs w:val="22"/>
               </w:rPr>
-              <w:t xml:space="preserve">H2 – H1 + limiares (final)</w:t>
+              <w:t xml:space="preserve">FL – F + limiar de déficit (final)</w:t>
             </w:r>
           </w:p>
         </w:tc>
@@ -4420,7 +5083,7 @@
                 <w:sz w:val="22"/>
                 <w:szCs w:val="22"/>
               </w:rPr>
-              <w:t xml:space="preserve">740</w:t>
+              <w:t xml:space="preserve">739</w:t>
             </w:r>
           </w:p>
         </w:tc>
@@ -4446,7 +5109,7 @@
                 <w:sz w:val="22"/>
                 <w:szCs w:val="22"/>
               </w:rPr>
-              <w:t xml:space="preserve">0,31</w:t>
+              <w:t xml:space="preserve">0,34</w:t>
             </w:r>
           </w:p>
         </w:tc>
@@ -4472,7 +5135,7 @@
                 <w:sz w:val="22"/>
                 <w:szCs w:val="22"/>
               </w:rPr>
-              <w:t xml:space="preserve">684</w:t>
+              <w:t xml:space="preserve">638</w:t>
             </w:r>
           </w:p>
         </w:tc>
@@ -4498,7 +5161,7 @@
                 <w:sz w:val="22"/>
                 <w:szCs w:val="22"/>
               </w:rPr>
-              <w:t xml:space="preserve">0,26</w:t>
+              <w:t xml:space="preserve">0,38</w:t>
             </w:r>
           </w:p>
         </w:tc>
@@ -4516,7 +5179,16 @@
           <w:sz w:val="22"/>
           <w:szCs w:val="22"/>
         </w:rPr>
-        <w:t xml:space="preserve">Tabela 4 – Desempenho dos modelos (Etapa 4). RMSE em kg/ha. Fonte: elaboração própria (2026).</w:t>
+        <w:t xml:space="preserve">Tabela 5 – Desempenho dos modelos com o clima do NASA POWER (Etapa 5, 8.651 pares município–safra). RMSE em kg/ha.</w:t>
+      </w:r>
+      <w:r>
+        <w:rPr>
+          <w:i/>
+          <w:iCs/>
+          <w:sz w:val="22"/>
+          <w:szCs w:val="22"/>
+        </w:rPr>
+        <w:t xml:space="preserve"> Fonte: elaboração própria (2026).</w:t>
       </w:r>
     </w:p>
     <w:p>
@@ -4545,7 +5217,7 @@
           <w:sz w:val="24"/>
           <w:szCs w:val="24"/>
         </w:rPr>
-        <w:t xml:space="preserve">Os coeficientes do modelo F, mais estáveis para interpretação, indicam (sobre o desvio em relação ao patamar): +208 kg/ha a cada 100 mm de chuva em dez–fev acima da média (≈417 mm), com ganho decrescente (termo quadrático negativo); +30 kg/ha por ponto percentual de umidade relativa mínima em dez–fev; +59 kg/ha a cada 100 mm de chuva em março; e −2,7 kg/ha por dia de calor. A chuva de out–nov não teve efeito significativo. A Figura 4 decompõe a previsão de cada safra na contribuição de cada fator: em média, a chuva de dez–fev move a previsão em ≈250 kg/ha e a umidade mínima em ≈170 kg/ha, enquanto chuva de março e calor pesam ≈35 kg/ha cada – o período de floração e enchimento concentra praticamente todo o efeito do clima. No modelo H2, os termos de seca extrema foram significativos: cada 100 mm de déficit acima de ≈243 mm reduz o rendimento em ≈300 kg/ha adicionais, e cada ponto de umidade mínima abaixo de ≈41,5% em ≈37 kg/ha adicionais, evidenciando que a perda se acelera quando a seca passa de um limite. O déficit hídrico foi o melhor indicador isolado de seca (correlação de −0,61 com o desvio do rendimento). Os p-valores tendem a ser otimistas, pois linhas da mesma safra compartilham o mesmo ano climático.</w:t>
+        <w:t xml:space="preserve">Os coeficientes do modelo final (FL, ajustado com todos os pares e o clima do NASA POWER) indicam, sobre o desvio em relação ao patamar: +378 kg/ha a cada 100 mm de chuva em dez–fev acima da média (≈370 mm), com ganho decrescente (termo quadrático negativo); +20 kg/ha por ponto percentual de umidade relativa mínima em dez–fev; e −258 kg/ha a cada 100 mm de déficit hídrico acima de ≈287 mm (o percentil 80 da base), a perda adicional da seca extrema. A Figura 4 decompõe a previsão de cada safra na contribuição de cada fator: em média, a chuva de dez–fev move a previsão em ≈376 kg/ha e a umidade mínima em ≈133 kg/ha; o termo de seca extrema (≈65 kg/ha em média) só atua nas safras mais secas (2005, 2012, 2022 e 2023), e as chuvas de out–nov e de março quase não pesam – o período de floração e enchimento concentra praticamente todo o efeito do clima. Os efeitos pequenos mudam de sinal ou perdem significância entre as fontes de clima e não devem ser interpretados isoladamente: os dias de calor, por exemplo, aparecem com contribuição positiva em safras quentes, o que reflete a colinearidade com a umidade mínima, e não um efeito agronômico. Com as estações do INMET, o déficit hídrico foi o melhor indicador isolado de seca (correlação de −0,61 com o desvio do rendimento). Os p-valores tendem a ser otimistas, pois linhas da mesma safra compartilham o mesmo ano climático.</w:t>
       </w:r>
     </w:p>
     <w:p>
@@ -4557,7 +5229,7 @@
       <w:r>
         <w:drawing>
           <wp:inline distT="0" distB="0" distL="0" distR="0">
-            <wp:extent cx="4860036" cy="3390722"/>
+            <wp:extent cx="4860036" cy="2835021"/>
             <wp:effectExtent l="0" t="0" r="0" b="0"/>
             <wp:docPr id="904" name="Imagem 904"/>
             <wp:cNvGraphicFramePr>
@@ -4579,7 +5251,7 @@
                   <pic:spPr>
                     <a:xfrm>
                       <a:off x="0" y="0"/>
-                      <a:ext cx="4860036" cy="3390722"/>
+                      <a:ext cx="4860036" cy="2835021"/>
                     </a:xfrm>
                     <a:prstGeom prst="rect">
                       <a:avLst/>
@@ -4604,7 +5276,25 @@
           <w:sz w:val="22"/>
           <w:szCs w:val="22"/>
         </w:rPr>
-        <w:t xml:space="preserve">Figura 4 – Contribuição de cada fator climático para o desvio do rendimento em relação ao patamar, por safra (modelo F; equivalente aos valores SHAP). Losango: desvio previsto; círculo: desvio observado. Fonte: elaboração própria (2026).</w:t>
+        <w:t xml:space="preserve">Figura 4 – Contribuição de cada fator climático para o desvio do rendimento em relação ao patamar, </w:t>
+      </w:r>
+      <w:r>
+        <w:rPr>
+          <w:i/>
+          <w:iCs/>
+          <w:sz w:val="22"/>
+          <w:szCs w:val="22"/>
+        </w:rPr>
+        <w:t xml:space="preserve">por safra (modelo FL com o clima do NASA POWER; equivalente aos valores SHAP)</w:t>
+      </w:r>
+      <w:r>
+        <w:rPr>
+          <w:i/>
+          <w:iCs/>
+          <w:sz w:val="22"/>
+          <w:szCs w:val="22"/>
+        </w:rPr>
+        <w:t xml:space="preserve">. Losango: desvio previsto; círculo: desvio observado. Fonte: elaboração própria (2026).</w:t>
       </w:r>
     </w:p>
     <w:p>
@@ -4633,7 +5323,7 @@
           <w:sz w:val="24"/>
           <w:szCs w:val="24"/>
         </w:rPr>
-        <w:t xml:space="preserve">A Figura 5 mostra, para cada safra prevista sem ter sido vista pelo modelo, o desvio médio estadual em relação ao patamar. As quebras de 2012 e 2023 foram antecipadas praticamente por inteiro, e a de 2022 passou de ≈25% para ≈36% de captação com o balanço hídrico e os limiares. A quebra de 2020 (≈1.180 kg/ha abaixo do patamar) não foi captada (≈3%): pelas estações do INMET, o verão de 2020 foi apenas moderadamente seco (déficit médio de 234 mm, contra 322 mm em 2012), com primavera chuvosa. A perda de 2020 não está nas variáveis disponíveis – possivelmente por chuva concentrada em poucos eventos, estações distantes das lavouras ou efeitos fora de dez–fev –, o que caracteriza um limite de informação, e não de algoritmo.</w:t>
+        <w:t xml:space="preserve">A Figura 5 mostra, para cada safra prevista sem ter sido vista pelo modelo, o desvio médio estadual em relação ao patamar. Com o modelo FL e o NASA POWER, a quebra de 2023 foi antecipada por inteiro, e as de 2012 e 2022 em parte (≈61% e ≈35%). A quebra de 2020 (≈1.130 kg/ha abaixo do patamar) foi a menos captada: ≈16%, contra ≈3% com as estações do INMET. Pelas estações, o verão de 2020 foi apenas moderadamente seco (déficit médio de 234 mm, contra 322 mm em 2012), com primavera chuvosa. A maior parte da perda de 2020 não está nas variáveis disponíveis – possivelmente por chuva concentrada em poucos eventos ou efeitos fora de dez–fev –, o que caracteriza um limite de informação, e não de algoritmo.</w:t>
       </w:r>
     </w:p>
     <w:p>
@@ -4645,7 +5335,7 @@
       <w:r>
         <w:drawing>
           <wp:inline distT="0" distB="0" distL="0" distR="0">
-            <wp:extent cx="4860036" cy="2162200"/>
+            <wp:extent cx="4860036" cy="2187016"/>
             <wp:effectExtent l="0" t="0" r="0" b="0"/>
             <wp:docPr id="905" name="Imagem 905"/>
             <wp:cNvGraphicFramePr>
@@ -4667,7 +5357,7 @@
                   <pic:spPr>
                     <a:xfrm>
                       <a:off x="0" y="0"/>
-                      <a:ext cx="4860036" cy="2162200"/>
+                      <a:ext cx="4860036" cy="2187016"/>
                     </a:xfrm>
                     <a:prstGeom prst="rect">
                       <a:avLst/>
@@ -4692,7 +5382,25 @@
           <w:sz w:val="22"/>
           <w:szCs w:val="22"/>
         </w:rPr>
-        <w:t xml:space="preserve">Figura 5 – Desvio médio estadual em relação ao patamar, por safra, na validação deixando uma safra de fora: observado e previsto pelos modelos F e H2. Fonte: elaboração própria (2026).</w:t>
+        <w:t xml:space="preserve">Figura 5 – Desvio médio estadual em relação ao patamar, por safra, na validação deixando uma safra de fora: </w:t>
+      </w:r>
+      <w:r>
+        <w:rPr>
+          <w:i/>
+          <w:iCs/>
+          <w:sz w:val="22"/>
+          <w:szCs w:val="22"/>
+        </w:rPr>
+        <w:t xml:space="preserve">observado e previsto pelos modelos F e FL, com o clima do NASA POWER.</w:t>
+      </w:r>
+      <w:r>
+        <w:rPr>
+          <w:i/>
+          <w:iCs/>
+          <w:sz w:val="22"/>
+          <w:szCs w:val="22"/>
+        </w:rPr>
+        <w:t xml:space="preserve"> Fonte: elaboração própria (2026).</w:t>
       </w:r>
     </w:p>
     <w:p>
@@ -4721,7 +5429,7 @@
           <w:sz w:val="24"/>
           <w:szCs w:val="24"/>
         </w:rPr>
-        <w:t xml:space="preserve">O erro relativo (MAE como percentual do rendimento médio) foi menor no Nordeste (17,8%) e no Noroeste (18,6%) – principal região produtora, com mais da metade das linhas da base – e maior no Sudeste (27,2%) e no Sudoeste (28,6%), regiões de produtividade média menor (Figura 6). Entre os 375 municípios com pelo menos 8 safras avaliadas, o erro relativo mediano foi de 19,9% (metade entre 16% e 25%), e municípios mais produtivos tiveram erro relativo menor (correlação de −0,62). Esses valores referem-se ao modelo F; o modelo H2 difere dele em menos de 1% no RMSE dessa validação.</w:t>
+        <w:t xml:space="preserve">Na validação deixando uma safra de fora, o erro relativo do modelo final (MAE como percentual do rendimento médio) foi menor no Nordeste (16,1%) e no Noroeste (17,1%) – principal região produtora, com mais da metade das linhas da base – e maior no Sudeste (27,4%) e no Sudoeste (28,1%), regiões de produtividade média menor (Figura 6). Entre os 424 municípios com pelo menos 8 safras avaliadas, o erro relativo mediano foi de 18,0% (metade entre 15% e 23%), e municípios mais produtivos tiveram erro relativo menor (correlação de −0,68). Na média estadual de cada safra, o erro foi de ≈250 kg/ha (≈10% do rendimento médio), com correlação de 0,78 com o observado.</w:t>
       </w:r>
     </w:p>
     <w:p>
@@ -4733,7 +5441,7 @@
       <w:r>
         <w:drawing>
           <wp:inline distT="0" distB="0" distL="0" distR="0">
-            <wp:extent cx="3780027" cy="2105331"/>
+            <wp:extent cx="3780027" cy="2126265"/>
             <wp:effectExtent l="0" t="0" r="0" b="0"/>
             <wp:docPr id="906" name="Imagem 906"/>
             <wp:cNvGraphicFramePr>
@@ -4755,7 +5463,7 @@
                   <pic:spPr>
                     <a:xfrm>
                       <a:off x="0" y="0"/>
-                      <a:ext cx="3780027" cy="2105331"/>
+                      <a:ext cx="3780027" cy="2126265"/>
                     </a:xfrm>
                     <a:prstGeom prst="rect">
                       <a:avLst/>
@@ -4780,7 +5488,25 @@
           <w:sz w:val="22"/>
           <w:szCs w:val="22"/>
         </w:rPr>
-        <w:t xml:space="preserve">Figura 6 – Erro relativo (MAE % do rendimento médio) por mesorregião do IBGE, nas duas validações (modelo F). Fonte: elaboração própria (2026).</w:t>
+        <w:t xml:space="preserve">Figura 6 – Erro relativo (MAE % do rendimento médio) por mesorregião do IBGE, </w:t>
+      </w:r>
+      <w:r>
+        <w:rPr>
+          <w:i/>
+          <w:iCs/>
+          <w:sz w:val="22"/>
+          <w:szCs w:val="22"/>
+        </w:rPr>
+        <w:t xml:space="preserve">nas duas validações (modelo FL com o clima do NASA POWER).</w:t>
+      </w:r>
+      <w:r>
+        <w:rPr>
+          <w:i/>
+          <w:iCs/>
+          <w:sz w:val="22"/>
+          <w:szCs w:val="22"/>
+        </w:rPr>
+        <w:t xml:space="preserve"> Fonte: elaboração própria (2026).</w:t>
       </w:r>
     </w:p>
     <w:p>
@@ -4899,7 +5625,21 @@
           <w:sz w:val="24"/>
           <w:szCs w:val="24"/>
         </w:rPr>
-        <w:t xml:space="preserve">O por tonelada adicional (aplicado aqui de forma proporcional). A dose é apresentada para as cinco classes, e o produtor identifica a sua pela análise de solo (Tabela 2.3). Duas regras de interpretação do grupo: doses zero da tabela (classe “Muito alto”, 1º cultivo) foram mantidas em zero, e rendimentos esperados abaixo de 2 t/ha usam a dose da tabela, sem redução. O resultado, para 431 municípios, está no arquivo recomendacao_adubacao_safra2026.csv (pasta dataset/processed do repositório); a Tabela 5 ilustra três mesorregiões.</w:t>
+        <w:t xml:space="preserve">O por tonelada adicional (aplicado aqui de forma proporcional). A dose é apresentada para as cinco classes, e o produtor identifica a sua pela análise de solo (Tabela 2.3). Duas regras de interpretação do grupo: doses zero da tabela (classe “Muito alto”, 1º cultivo) foram mantidas em zero, e rendimentos esperados abaixo de 2 t/ha usam a dose da tabela, sem redução. O resultado, para 431 municípios, está no arquivo recomendacao_adubacao_safra2026.csv (pasta dataset/processed do repositório); </w:t>
+      </w:r>
+      <w:r>
+        <w:rPr>
+          <w:sz w:val="24"/>
+          <w:szCs w:val="24"/>
+        </w:rPr>
+        <w:t xml:space="preserve">a Tabela 6 ilustra três mesorregiões</w:t>
+      </w:r>
+      <w:r>
+        <w:rPr>
+          <w:sz w:val="24"/>
+          <w:szCs w:val="24"/>
+        </w:rPr>
+        <w:t xml:space="preserve">.</w:t>
       </w:r>
     </w:p>
     <w:tbl>
@@ -6192,7 +6932,16 @@
           <w:sz w:val="22"/>
           <w:szCs w:val="22"/>
         </w:rPr>
-        <w:t xml:space="preserve">Tabela 5 – Dose recomendada no 1º cultivo (kg/ha) para o rendimento esperado mediano de três mesorregiões, por classe de teor do solo. Fonte: elaboração própria a partir de Embrapa/CQFS-RS/SC (2026).</w:t>
+        <w:t xml:space="preserve">Tabela 6 – Dose recomendada</w:t>
+      </w:r>
+      <w:r>
+        <w:rPr>
+          <w:i/>
+          <w:iCs/>
+          <w:sz w:val="22"/>
+          <w:szCs w:val="22"/>
+        </w:rPr>
+        <w:t xml:space="preserve"> no 1º cultivo (kg/ha) para o rendimento esperado mediano de três mesorregiões, por classe de teor do solo. Fonte: elaboração própria a partir de Embrapa/CQFS-RS/SC (2026).</w:t>
       </w:r>
     </w:p>
     <w:p>
@@ -6220,7 +6969,28 @@
           <w:sz w:val="24"/>
           <w:szCs w:val="24"/>
         </w:rPr>
-        <w:t xml:space="preserve">Ao contrário do que sugerem estudos com bases maiores (Jeong et al., 2016; Von Bloh et al., 2023), a regressão linear superou Random Forest e Gradient Boosting. Dois fatores explicam o resultado: a base tem cerca de 5 mil linhas e 21 safras, pouco para modelos mais flexíveis; e as secas recentes foram mais extremas que qualquer safra do treino – 2022 teve 44 dias de calor em dez–fev, contra no máximo 33 até 2020 –, e modelos de árvores não extrapolam além dos valores observados no treino. A não linearidade relevante (perda que se acelera na seca extrema) foi capturada por termos de limiar explícitos, mantendo o modelo interpretável.</w:t>
+        <w:t xml:space="preserve">Ao contrário do que sugerem estudos com bases maiores (Jeong et al., 2016; Von Bloh et al., 2023), a regressão linear superou Random Forest e Gradient Boosting. Dois fatores explicam o resultado: a base tem </w:t>
+      </w:r>
+      <w:r>
+        <w:rPr>
+          <w:sz w:val="24"/>
+          <w:szCs w:val="24"/>
+        </w:rPr>
+        <w:t xml:space="preserve">cerca de 8,6 mil linhas</w:t>
+      </w:r>
+      <w:r>
+        <w:rPr>
+          <w:sz w:val="24"/>
+          <w:szCs w:val="24"/>
+        </w:rPr>
+        <w:t xml:space="preserve"> e 21 safras, pouco para modelos mais flexíveis; e as secas recentes foram mais extremas que qualquer safra do treino – 2022 teve 44 dias de calor em dez–fev, contra no máximo 33 até 2020 –, e modelos de árvores não extrapolam além dos valores observados no treino. A não linearidade relevante (perda que se acelera na seca extrema) </w:t>
+      </w:r>
+      <w:r>
+        <w:rPr>
+          <w:sz w:val="24"/>
+          <w:szCs w:val="24"/>
+        </w:rPr>
+        <w:t xml:space="preserve">foi capturada por um termo de limiar explícito, mantendo o modelo interpretável. A fonte do clima pesou mais do que a escolha entre os modelos lineares: a troca das estações pelo NASA POWER reduziu o erro nos mesmos pares mais do que qualquer variação de modelo, além de incluir todos os municípios.</w:t>
       </w:r>
     </w:p>
     <w:p>
@@ -6234,7 +7004,21 @@
           <w:sz w:val="24"/>
           <w:szCs w:val="24"/>
         </w:rPr>
-        <w:t xml:space="preserve">O erro remanescente (≈20% por município) reflete principalmente limites de informação: metade dos pares município–safra com rendimento não tem clima do INMET com cobertura suficiente; o clima de cada município vem da estação mais próxima, que pode estar a dezenas de quilômetros; e fatores como pragas, doenças, data de semeadura e manejo não estão nos dados. O próprio rendimento municipal da PAM é uma estimativa, e alguns municípios apresentam valores idênticos em safras consecutivas. Hipóteses declaradas: CAD única de 75 mm e coeficiente de cultura igual a 1 no balanço hídrico; e, na adubação, uso de recomendação normativa (não de dose aplicada), com rendimento esperado que inclui três secas recentes e pode estar abaixo do potencial do produtor. Como extensões, a inclusão de clima em grade (ex.: NASA POWER) ampliaria a cobertura e aproximaria o clima das lavouras, e índices de vegetação por satélite (NDVI) poderiam captar perdas que o clima não explica, como a de 2020.</w:t>
+        <w:t xml:space="preserve">O erro remanescente (≈18% por município) reflete principalmente limites de informação: o NASA POWER é uma reanálise em grade de ≈50 km, não uma medição local, e municípios na mesma célula recebem o mesmo clima; a umidade relativa mínima é estimada, e não medida; e fatores</w:t>
+      </w:r>
+      <w:r>
+        <w:rPr>
+          <w:sz w:val="24"/>
+          <w:szCs w:val="24"/>
+        </w:rPr>
+        <w:t xml:space="preserve"> como pragas, doenças, data de semeadura e manejo não estão nos dados. O próprio rendimento municipal da PAM é uma estimativa, e alguns municípios apresentam valores idênticos em safras consecutivas. Hipóteses declaradas: CAD única de 75 mm e coeficiente de cultura igual a 1 no balanço hídrico; e, na adubação, uso de recomendação normativa (não de dose aplicada), com rendimento esperado que inclui três secas recentes e pode estar abaixo do potencial do produtor. </w:t>
+      </w:r>
+      <w:r>
+        <w:rPr>
+          <w:sz w:val="24"/>
+          <w:szCs w:val="24"/>
+        </w:rPr>
+        <w:t xml:space="preserve">Como extensão, índices de vegetação por satélite (NDVI) poderiam captar perdas que o clima não explica, como a maior parte da de 2020.</w:t>
       </w:r>
     </w:p>
     <w:p>
@@ -6262,7 +7046,49 @@
           <w:sz w:val="24"/>
           <w:szCs w:val="24"/>
         </w:rPr>
-        <w:t xml:space="preserve">O trabalho construiu uma base municipal integrada e reprodutível e um modelo que prevê, ao fim de março, o rendimento da soja de cada município do RS com erro ≈14–22% menor que a média histórica do município. Os resultados mostram que, para este problema, a forma de representar o clima e o patamar de produtividade pesou mais do que a escolha do algoritmo: resumir a chuva por subperíodo, calcular o patamar apenas com o passado e representar explicitamente a seca extrema trouxeram os ganhos, enquanto modelos de árvores não superaram a regressão linear. A chuva, a umidade e o déficit hídrico de dezembro a fevereiro concentram o efeito do clima. A aplicação em adubação mostra como a previsão pode apoiar uma decisão agronômica concreta, mantendo a análise de solo do produtor como referência.</w:t>
+        <w:t xml:space="preserve">O trabalho construiu uma base municipal integrada e reprodutível e um modelo que prevê, ao fim de março, o rendimento da soja de cada município do RS </w:t>
+      </w:r>
+      <w:r>
+        <w:rPr>
+          <w:sz w:val="24"/>
+          <w:szCs w:val="24"/>
+        </w:rPr>
+        <w:t xml:space="preserve">com erro ≈16–28% menor</w:t>
+      </w:r>
+      <w:r>
+        <w:rPr>
+          <w:sz w:val="24"/>
+          <w:szCs w:val="24"/>
+        </w:rPr>
+        <w:t xml:space="preserve"> que a média histórica do município. Os resultados mostram que, para este problema, a forma de representar o clima e o patamar de produtividade pesou mais do que a escolha do algoritmo: resumir a chuva por subperíodo, </w:t>
+      </w:r>
+      <w:r>
+        <w:rPr>
+          <w:sz w:val="24"/>
+          <w:szCs w:val="24"/>
+        </w:rPr>
+        <w:t xml:space="preserve">calcular o patamar apenas com o passado, usar um clima em grade sem falhas (NASA POWER) e representar explicitamente</w:t>
+      </w:r>
+      <w:r>
+        <w:rPr>
+          <w:sz w:val="24"/>
+          <w:szCs w:val="24"/>
+        </w:rPr>
+        <w:t xml:space="preserve"> a seca extrema trouxeram os ganhos, enquanto modelos de árvores não superaram a regressão linear. </w:t>
+      </w:r>
+      <w:r>
+        <w:rPr>
+          <w:sz w:val="24"/>
+          <w:szCs w:val="24"/>
+        </w:rPr>
+        <w:t xml:space="preserve">A chuva e a umidade de dezembro a fevereiro concentram o efeito do clima, e a perda se acelera quando o déficit hídrico passa de um limite.</w:t>
+      </w:r>
+      <w:r>
+        <w:rPr>
+          <w:sz w:val="24"/>
+          <w:szCs w:val="24"/>
+        </w:rPr>
+        <w:t xml:space="preserve"> A aplicação em adubação mostra como a previsão pode apoiar uma decisão agronômica concreta, mantendo a análise de solo do produtor como referência.</w:t>
       </w:r>
     </w:p>
     <w:p>
@@ -6425,6 +7251,20 @@
           <w:szCs w:val="22"/>
         </w:rPr>
         <w:t xml:space="preserve">LUNDBERG, S. M.; LEE, S.-I. A unified approach to interpreting model predictions. In: Advances in Neural Information Processing Systems 30 (NIPS 2017). p. 4765–4774, 2017.</w:t>
+      </w:r>
+    </w:p>
+    <w:p>
+      <w:pPr>
+        <w:spacing w:after="160" w:line="276" w:lineRule="auto"/>
+        <w:ind w:left="431" w:hanging="431"/>
+        <w:jc w:val="left"/>
+      </w:pPr>
+      <w:r>
+        <w:rPr>
+          <w:sz w:val="22"/>
+          <w:szCs w:val="22"/>
+        </w:rPr>
+        <w:t xml:space="preserve">NASA – NATIONAL AERONAUTICS AND SPACE ADMINISTRATION. Langley Research Center. POWER – Prediction Of Worldwide Energy Resources: Daily API. Disponível em: https://power.larc.nasa.gov/. Acesso em: 23 out. 2026.</w:t>
       </w:r>
     </w:p>
     <w:p>

</xml_diff>